<commit_message>
Update blog, posts, marketing carousels, and routine files
Co-Authored-By: Claude Sonnet 4.6 <noreply@anthropic.com>
</commit_message>
<xml_diff>
--- a/routine/routine.docx
+++ b/routine/routine.docx
@@ -4,34 +4,28 @@
   <w:body>
     <w:p>
       <w:pPr>
-        <w:spacing w:after="60"/>
-        <w:jc w:val="left"/>
+        <w:pStyle w:val="Title"/>
+        <w:jc w:val="center"/>
       </w:pPr>
       <w:r>
-        <w:rPr>
-          <w:rFonts w:ascii="Calibri" w:hAnsi="Calibri"/>
-          <w:b/>
-          <w:color w:val="0B2545"/>
-          <w:sz w:val="44"/>
-        </w:rPr>
         <w:t>Coffee Bean Website Extraction Routine</w:t>
       </w:r>
     </w:p>
     <w:p>
       <w:pPr>
-        <w:spacing w:after="240"/>
+        <w:jc w:val="center"/>
       </w:pPr>
       <w:r>
         <w:rPr>
           <w:i/>
-          <w:color w:val="555555"/>
         </w:rPr>
-        <w:t>Repeatable SOP for rebuilding or updating the coffee bean spreadsheet from a list of roastery websites.</w:t>
+        <w:t>SOP for rebuilding or appending coffee bean rows in the master spreadsheet.</w:t>
       </w:r>
     </w:p>
     <w:p>
       <w:pPr>
         <w:pStyle w:val="Heading1"/>
+        <w:spacing w:before="160" w:after="80"/>
       </w:pPr>
       <w:r>
         <w:t>1. Purpose</w:t>
@@ -39,67 +33,50 @@
     </w:p>
     <w:p>
       <w:r>
-        <w:t>Use this routine whenever a user gives one or more roastery websites and asks for coffee beans to be added to, or rebuilt in, the spreadsheet. The output must keep the existing column order and formatting, produce one coffee bean listing per row, and use the fixed validation values exactly where required.</w:t>
+        <w:t>Use this routine whenever coffee bean listings need to be extracted from roastery websites into the spreadsheet. The output must keep the workbook structure, columns, table formatting, filters, and validation rules intact.</w:t>
       </w:r>
     </w:p>
     <w:p>
       <w:pPr>
         <w:pStyle w:val="Heading1"/>
+        <w:spacing w:before="160" w:after="80"/>
       </w:pPr>
       <w:r>
-        <w:t>2. Operating Modes</w:t>
+        <w:t>2. Operating Mode</w:t>
       </w:r>
     </w:p>
     <w:tbl>
       <w:tblPr>
         <w:tblStyle w:val="TableGrid"/>
-        <w:tblW w:type="dxa" w:w="9360"/>
-        <w:jc w:val="left"/>
-        <w:tblLayout w:type="fixed"/>
+        <w:tblW w:type="auto" w:w="0"/>
         <w:tblLook w:firstColumn="1" w:firstRow="1" w:lastColumn="0" w:lastRow="0" w:noHBand="0" w:noVBand="1" w:val="04A0"/>
       </w:tblPr>
       <w:tblGrid>
-        <w:gridCol w:w="4680"/>
-        <w:gridCol w:w="4680"/>
+        <w:gridCol w:w="5040"/>
+        <w:gridCol w:w="5040"/>
       </w:tblGrid>
       <w:tr>
         <w:tc>
           <w:tcPr>
-            <w:tcW w:type="dxa" w:w="2500"/>
-            <w:vAlign w:val="center"/>
-            <w:shd w:fill="E8EEF5"/>
+            <w:tcW w:type="dxa" w:w="5040"/>
           </w:tcPr>
           <w:p>
-            <w:pPr>
-              <w:spacing w:after="0" w:line="276" w:lineRule="auto"/>
-            </w:pPr>
             <w:r>
               <w:rPr>
-                <w:rFonts w:ascii="Calibri" w:hAnsi="Calibri"/>
                 <w:b/>
-                <w:color w:val="1F4D78"/>
-                <w:sz w:val="19"/>
               </w:rPr>
-              <w:t>Item</w:t>
+              <w:t>Mode</w:t>
             </w:r>
           </w:p>
         </w:tc>
         <w:tc>
           <w:tcPr>
-            <w:tcW w:type="dxa" w:w="6860"/>
-            <w:vAlign w:val="center"/>
-            <w:shd w:fill="E8EEF5"/>
+            <w:tcW w:type="dxa" w:w="5040"/>
           </w:tcPr>
           <w:p>
-            <w:pPr>
-              <w:spacing w:after="0" w:line="276" w:lineRule="auto"/>
-            </w:pPr>
             <w:r>
               <w:rPr>
-                <w:rFonts w:ascii="Calibri" w:hAnsi="Calibri"/>
                 <w:b/>
-                <w:color w:val="1F4D78"/>
-                <w:sz w:val="19"/>
               </w:rPr>
               <w:t>Instruction</w:t>
             </w:r>
@@ -109,37 +86,21 @@
       <w:tr>
         <w:tc>
           <w:tcPr>
-            <w:tcW w:type="dxa" w:w="2500"/>
-            <w:vAlign w:val="center"/>
+            <w:tcW w:type="dxa" w:w="5040"/>
           </w:tcPr>
           <w:p>
-            <w:pPr>
-              <w:spacing w:after="0" w:line="276" w:lineRule="auto"/>
-            </w:pPr>
             <w:r>
-              <w:rPr>
-                <w:rFonts w:ascii="Calibri" w:hAnsi="Calibri"/>
-                <w:sz w:val="19"/>
-              </w:rPr>
-              <w:t>Rebuild / clear mode</w:t>
+              <w:t>Rebuild / clear</w:t>
             </w:r>
           </w:p>
         </w:tc>
         <w:tc>
           <w:tcPr>
-            <w:tcW w:type="dxa" w:w="6860"/>
-            <w:vAlign w:val="center"/>
+            <w:tcW w:type="dxa" w:w="5040"/>
           </w:tcPr>
           <w:p>
-            <w:pPr>
-              <w:spacing w:after="0" w:line="276" w:lineRule="auto"/>
-            </w:pPr>
             <w:r>
-              <w:rPr>
-                <w:rFonts w:ascii="Calibri" w:hAnsi="Calibri"/>
-                <w:sz w:val="19"/>
-              </w:rPr>
-              <w:t>If the user says clear the list, replace the existing data rows. Keep the same header row, table formatting, filters, and workbook/sheet structure.</w:t>
+              <w:t>Replace existing data rows only. Preserve headers, sheets, tables, filters, formatting, and validation.</w:t>
             </w:r>
           </w:p>
         </w:tc>
@@ -147,37 +108,21 @@
       <w:tr>
         <w:tc>
           <w:tcPr>
-            <w:tcW w:type="dxa" w:w="2500"/>
-            <w:vAlign w:val="center"/>
+            <w:tcW w:type="dxa" w:w="5040"/>
           </w:tcPr>
           <w:p>
-            <w:pPr>
-              <w:spacing w:after="0" w:line="276" w:lineRule="auto"/>
-            </w:pPr>
             <w:r>
-              <w:rPr>
-                <w:rFonts w:ascii="Calibri" w:hAnsi="Calibri"/>
-                <w:sz w:val="19"/>
-              </w:rPr>
-              <w:t>Append mode</w:t>
+              <w:t>Append</w:t>
             </w:r>
           </w:p>
         </w:tc>
         <w:tc>
           <w:tcPr>
-            <w:tcW w:type="dxa" w:w="6860"/>
-            <w:vAlign w:val="center"/>
+            <w:tcW w:type="dxa" w:w="5040"/>
           </w:tcPr>
           <w:p>
-            <w:pPr>
-              <w:spacing w:after="0" w:line="276" w:lineRule="auto"/>
-            </w:pPr>
             <w:r>
-              <w:rPr>
-                <w:rFonts w:ascii="Calibri" w:hAnsi="Calibri"/>
-                <w:sz w:val="19"/>
-              </w:rPr>
-              <w:t>If the user says add into the file, append new website rows below the existing rows. Do not delete existing data unless explicitly told to clear or replace.</w:t>
+              <w:t>Add new bean rows below existing rows. Do not delete existing rows unless explicitly instructed.</w:t>
             </w:r>
           </w:p>
         </w:tc>
@@ -185,144 +130,128 @@
       <w:tr>
         <w:tc>
           <w:tcPr>
-            <w:tcW w:type="dxa" w:w="2500"/>
-            <w:vAlign w:val="center"/>
+            <w:tcW w:type="dxa" w:w="5040"/>
           </w:tcPr>
           <w:p>
-            <w:pPr>
-              <w:spacing w:after="0" w:line="276" w:lineRule="auto"/>
-            </w:pPr>
             <w:r>
-              <w:rPr>
-                <w:rFonts w:ascii="Calibri" w:hAnsi="Calibri"/>
-                <w:sz w:val="19"/>
-              </w:rPr>
-              <w:t>New workbook mode</w:t>
+              <w:t>New workbook</w:t>
             </w:r>
           </w:p>
         </w:tc>
         <w:tc>
           <w:tcPr>
-            <w:tcW w:type="dxa" w:w="6860"/>
-            <w:vAlign w:val="center"/>
+            <w:tcW w:type="dxa" w:w="5040"/>
           </w:tcPr>
           <w:p>
-            <w:pPr>
-              <w:spacing w:after="0" w:line="276" w:lineRule="auto"/>
-            </w:pPr>
             <w:r>
-              <w:rPr>
-                <w:rFonts w:ascii="Calibri" w:hAnsi="Calibri"/>
-                <w:sz w:val="19"/>
-              </w:rPr>
-              <w:t>If no workbook exists, create a new .xlsx with the same column order as the master sheet.</w:t>
+              <w:t>Create the same columns and validation rules as the master sheet if no workbook exists.</w:t>
             </w:r>
           </w:p>
         </w:tc>
       </w:tr>
     </w:tbl>
+    <w:p/>
     <w:p>
       <w:pPr>
         <w:pStyle w:val="Heading1"/>
+        <w:spacing w:before="160" w:after="80"/>
       </w:pPr>
       <w:r>
-        <w:t>3. Source Collection Workflow</w:t>
+        <w:t>3. Source Workflow</w:t>
       </w:r>
     </w:p>
     <w:p>
       <w:pPr>
-        <w:pStyle w:val="ListNumber"/>
+        <w:pStyle w:val="ListBullet"/>
+        <w:spacing w:after="20"/>
       </w:pPr>
       <w:r>
-        <w:t>Read the current workbook or CSV header row first. Do not assume columns have stayed in the same order.</w:t>
+        <w:t>Read routine.docx first, then read the workbook header row. Do not assume column order.</w:t>
       </w:r>
     </w:p>
     <w:p>
       <w:pPr>
-        <w:pStyle w:val="ListNumber"/>
+        <w:pStyle w:val="ListBullet"/>
+        <w:spacing w:after="20"/>
       </w:pPr>
       <w:r>
-        <w:t>Process websites one at a time. Finish one roastery before moving to the next.</w:t>
+        <w:t>Process one roastery at a time and cache the raw collection data plus product pages when needed.</w:t>
       </w:r>
     </w:p>
     <w:p>
       <w:pPr>
-        <w:pStyle w:val="ListNumber"/>
+        <w:pStyle w:val="ListBullet"/>
+        <w:spacing w:after="20"/>
       </w:pPr>
       <w:r>
-        <w:t>Prefer structured data over visual scraping. Try Shopify /collections/.../products.json?limit=250, EasyStore CollectionDataStorage, ProductDataStorage, embedded product JSON, or productVariants analytics payloads before scraping text manually.</w:t>
+        <w:t>Prefer structured product data: Shopify products.json, EasyStore embedded JSON, WooCommerce product variations, Wix warmup/product JSON, or other product JSON before visual scraping.</w:t>
       </w:r>
     </w:p>
     <w:p>
       <w:pPr>
-        <w:pStyle w:val="ListNumber"/>
+        <w:pStyle w:val="ListBullet"/>
+        <w:spacing w:after="20"/>
       </w:pPr>
       <w:r>
-        <w:t>Cache the raw collection HTML/JSON and, when needed, each product page. This makes the run auditable and avoids losing context if extraction needs a correction.</w:t>
+        <w:t>Include one actual roasted coffee bean product listing per row.</w:t>
       </w:r>
     </w:p>
     <w:p>
       <w:pPr>
-        <w:pStyle w:val="ListNumber"/>
+        <w:pStyle w:val="ListBullet"/>
+        <w:spacing w:after="20"/>
       </w:pPr>
       <w:r>
-        <w:t>Filter to actual coffee bean products. Skip packaging, equipment, merchandise, bundles, gift sets, drip bags, sample kits, aroma kits, and unrelated products unless the user explicitly asks for them.</w:t>
+        <w:t>Skip non-bean products, drip bags, capsules, instant coffee, bundles, gift sets, sample/taster kits, subscriptions-only bundles, equipment, merch, packaging, and workshop/event listings unless the user explicitly asks for them.</w:t>
       </w:r>
     </w:p>
     <w:p>
       <w:pPr>
-        <w:pStyle w:val="ListNumber"/>
+        <w:pStyle w:val="ListBullet"/>
+        <w:spacing w:after="20"/>
       </w:pPr>
       <w:r>
-        <w:t>Treat the same bean as separate rows if it is sold as separate Espresso, Filter, Omni/Both, roast level, processing, or subscription/product listings.</w:t>
+        <w:t>If the same bean is sold as separate Espresso, Filter, Omni/Both, roast level, processing, or product listings, keep those as separate rows.</w:t>
       </w:r>
     </w:p>
     <w:p>
       <w:pPr>
-        <w:pStyle w:val="ListNumber"/>
+        <w:pStyle w:val="ListBullet"/>
+        <w:spacing w:after="20"/>
       </w:pPr>
       <w:r>
-        <w:t>Use the product page for richer fields such as tasting notes, processing method, altitude, varietal, origin, roast level, and description. If only the collection card has data, use the card data.</w:t>
+        <w:t>Use product pages for exact details. Use collection-card data only when the product page does not expose a field.</w:t>
       </w:r>
     </w:p>
     <w:p>
       <w:pPr>
         <w:pStyle w:val="Heading1"/>
+        <w:spacing w:before="160" w:after="80"/>
       </w:pPr>
       <w:r>
-        <w:t>4. Required Column Mapping</w:t>
+        <w:t>4. Column Rules</w:t>
       </w:r>
     </w:p>
     <w:tbl>
       <w:tblPr>
         <w:tblStyle w:val="TableGrid"/>
-        <w:tblW w:type="dxa" w:w="9360"/>
-        <w:jc w:val="left"/>
-        <w:tblLayout w:type="fixed"/>
+        <w:tblW w:type="auto" w:w="0"/>
         <w:tblLook w:firstColumn="1" w:firstRow="1" w:lastColumn="0" w:lastRow="0" w:noHBand="0" w:noVBand="1" w:val="04A0"/>
       </w:tblPr>
       <w:tblGrid>
-        <w:gridCol w:w="3120"/>
-        <w:gridCol w:w="3120"/>
-        <w:gridCol w:w="3120"/>
+        <w:gridCol w:w="3360"/>
+        <w:gridCol w:w="3360"/>
+        <w:gridCol w:w="3360"/>
       </w:tblGrid>
       <w:tr>
         <w:tc>
           <w:tcPr>
-            <w:tcW w:type="dxa" w:w="900"/>
-            <w:vAlign w:val="center"/>
-            <w:shd w:fill="E8EEF5"/>
+            <w:tcW w:type="dxa" w:w="3360"/>
           </w:tcPr>
           <w:p>
-            <w:pPr>
-              <w:spacing w:after="0" w:line="276" w:lineRule="auto"/>
-            </w:pPr>
             <w:r>
               <w:rPr>
-                <w:rFonts w:ascii="Calibri" w:hAnsi="Calibri"/>
                 <w:b/>
-                <w:color w:val="1F4D78"/>
-                <w:sz w:val="19"/>
               </w:rPr>
               <w:t>Column</w:t>
             </w:r>
@@ -330,20 +259,12 @@
         </w:tc>
         <w:tc>
           <w:tcPr>
-            <w:tcW w:type="dxa" w:w="1900"/>
-            <w:vAlign w:val="center"/>
-            <w:shd w:fill="E8EEF5"/>
+            <w:tcW w:type="dxa" w:w="3360"/>
           </w:tcPr>
           <w:p>
-            <w:pPr>
-              <w:spacing w:after="0" w:line="276" w:lineRule="auto"/>
-            </w:pPr>
             <w:r>
               <w:rPr>
-                <w:rFonts w:ascii="Calibri" w:hAnsi="Calibri"/>
                 <w:b/>
-                <w:color w:val="1F4D78"/>
-                <w:sz w:val="19"/>
               </w:rPr>
               <w:t>Field</w:t>
             </w:r>
@@ -351,20 +272,12 @@
         </w:tc>
         <w:tc>
           <w:tcPr>
-            <w:tcW w:type="dxa" w:w="6560"/>
-            <w:vAlign w:val="center"/>
-            <w:shd w:fill="E8EEF5"/>
+            <w:tcW w:type="dxa" w:w="3360"/>
           </w:tcPr>
           <w:p>
-            <w:pPr>
-              <w:spacing w:after="0" w:line="276" w:lineRule="auto"/>
-            </w:pPr>
             <w:r>
               <w:rPr>
-                <w:rFonts w:ascii="Calibri" w:hAnsi="Calibri"/>
                 <w:b/>
-                <w:color w:val="1F4D78"/>
-                <w:sz w:val="19"/>
               </w:rPr>
               <w:t>Rule</w:t>
             </w:r>
@@ -374,55 +287,31 @@
       <w:tr>
         <w:tc>
           <w:tcPr>
-            <w:tcW w:type="dxa" w:w="900"/>
-            <w:vAlign w:val="center"/>
+            <w:tcW w:type="dxa" w:w="3360"/>
           </w:tcPr>
           <w:p>
-            <w:pPr>
-              <w:spacing w:after="0" w:line="276" w:lineRule="auto"/>
-            </w:pPr>
             <w:r>
-              <w:rPr>
-                <w:rFonts w:ascii="Calibri" w:hAnsi="Calibri"/>
-                <w:sz w:val="19"/>
-              </w:rPr>
               <w:t>A</w:t>
             </w:r>
           </w:p>
         </w:tc>
         <w:tc>
           <w:tcPr>
-            <w:tcW w:type="dxa" w:w="1900"/>
-            <w:vAlign w:val="center"/>
+            <w:tcW w:type="dxa" w:w="3360"/>
           </w:tcPr>
           <w:p>
-            <w:pPr>
-              <w:spacing w:after="0" w:line="276" w:lineRule="auto"/>
-            </w:pPr>
             <w:r>
-              <w:rPr>
-                <w:rFonts w:ascii="Calibri" w:hAnsi="Calibri"/>
-                <w:sz w:val="19"/>
-              </w:rPr>
               <w:t>SKU</w:t>
             </w:r>
           </w:p>
         </w:tc>
         <w:tc>
           <w:tcPr>
-            <w:tcW w:type="dxa" w:w="6560"/>
-            <w:vAlign w:val="center"/>
+            <w:tcW w:type="dxa" w:w="3360"/>
           </w:tcPr>
           <w:p>
-            <w:pPr>
-              <w:spacing w:after="0" w:line="276" w:lineRule="auto"/>
-            </w:pPr>
             <w:r>
-              <w:rPr>
-                <w:rFonts w:ascii="Calibri" w:hAnsi="Calibri"/>
-                <w:sz w:val="19"/>
-              </w:rPr>
-              <w:t>Use the source SKU when available. If missing, create a stable SKU from brand + product handle + variant id. In append mode, if the existing sheet uses numeric sequential SKUs, continue the sequence with zero padding.</w:t>
+              <w:t>Preserve the workbook convention. In rebuild mode, use sequential numeric SKUs unless the sheet already requires source SKUs.</w:t>
             </w:r>
           </w:p>
         </w:tc>
@@ -430,55 +319,31 @@
       <w:tr>
         <w:tc>
           <w:tcPr>
-            <w:tcW w:type="dxa" w:w="900"/>
-            <w:vAlign w:val="center"/>
+            <w:tcW w:type="dxa" w:w="3360"/>
           </w:tcPr>
           <w:p>
-            <w:pPr>
-              <w:spacing w:after="0" w:line="276" w:lineRule="auto"/>
-            </w:pPr>
             <w:r>
-              <w:rPr>
-                <w:rFonts w:ascii="Calibri" w:hAnsi="Calibri"/>
-                <w:sz w:val="19"/>
-              </w:rPr>
               <w:t>B</w:t>
             </w:r>
           </w:p>
         </w:tc>
         <w:tc>
           <w:tcPr>
-            <w:tcW w:type="dxa" w:w="1900"/>
-            <w:vAlign w:val="center"/>
+            <w:tcW w:type="dxa" w:w="3360"/>
           </w:tcPr>
           <w:p>
-            <w:pPr>
-              <w:spacing w:after="0" w:line="276" w:lineRule="auto"/>
-            </w:pPr>
             <w:r>
-              <w:rPr>
-                <w:rFonts w:ascii="Calibri" w:hAnsi="Calibri"/>
-                <w:sz w:val="19"/>
-              </w:rPr>
               <w:t>brands</w:t>
             </w:r>
           </w:p>
         </w:tc>
         <w:tc>
           <w:tcPr>
-            <w:tcW w:type="dxa" w:w="6560"/>
-            <w:vAlign w:val="center"/>
+            <w:tcW w:type="dxa" w:w="3360"/>
           </w:tcPr>
           <w:p>
-            <w:pPr>
-              <w:spacing w:after="0" w:line="276" w:lineRule="auto"/>
-            </w:pPr>
             <w:r>
-              <w:rPr>
-                <w:rFonts w:ascii="Calibri" w:hAnsi="Calibri"/>
-                <w:sz w:val="19"/>
-              </w:rPr>
-              <w:t>Use the roastery/store name exactly, for example 43 Coffee or Arkib Kopi.</w:t>
+              <w:t>Use the roastery/store name exactly.</w:t>
             </w:r>
           </w:p>
         </w:tc>
@@ -486,55 +351,31 @@
       <w:tr>
         <w:tc>
           <w:tcPr>
-            <w:tcW w:type="dxa" w:w="900"/>
-            <w:vAlign w:val="center"/>
+            <w:tcW w:type="dxa" w:w="3360"/>
           </w:tcPr>
           <w:p>
-            <w:pPr>
-              <w:spacing w:after="0" w:line="276" w:lineRule="auto"/>
-            </w:pPr>
             <w:r>
-              <w:rPr>
-                <w:rFonts w:ascii="Calibri" w:hAnsi="Calibri"/>
-                <w:sz w:val="19"/>
-              </w:rPr>
               <w:t>C</w:t>
             </w:r>
           </w:p>
         </w:tc>
         <w:tc>
           <w:tcPr>
-            <w:tcW w:type="dxa" w:w="1900"/>
-            <w:vAlign w:val="center"/>
+            <w:tcW w:type="dxa" w:w="3360"/>
           </w:tcPr>
           <w:p>
-            <w:pPr>
-              <w:spacing w:after="0" w:line="276" w:lineRule="auto"/>
-            </w:pPr>
             <w:r>
-              <w:rPr>
-                <w:rFonts w:ascii="Calibri" w:hAnsi="Calibri"/>
-                <w:sz w:val="19"/>
-              </w:rPr>
               <w:t>name</w:t>
             </w:r>
           </w:p>
         </w:tc>
         <w:tc>
           <w:tcPr>
-            <w:tcW w:type="dxa" w:w="6560"/>
-            <w:vAlign w:val="center"/>
+            <w:tcW w:type="dxa" w:w="3360"/>
           </w:tcPr>
           <w:p>
-            <w:pPr>
-              <w:spacing w:after="0" w:line="276" w:lineRule="auto"/>
-            </w:pPr>
             <w:r>
-              <w:rPr>
-                <w:rFonts w:ascii="Calibri" w:hAnsi="Calibri"/>
-                <w:sz w:val="19"/>
-              </w:rPr>
-              <w:t>Use the product/bean listing name. Preserve roast or brew method in the name only if it is part of the product title.</w:t>
+              <w:t>Use the product listing name. Preserve roast/brew method only when it is part of the title.</w:t>
             </w:r>
           </w:p>
         </w:tc>
@@ -542,55 +383,31 @@
       <w:tr>
         <w:tc>
           <w:tcPr>
-            <w:tcW w:type="dxa" w:w="900"/>
-            <w:vAlign w:val="center"/>
+            <w:tcW w:type="dxa" w:w="3360"/>
           </w:tcPr>
           <w:p>
-            <w:pPr>
-              <w:spacing w:after="0" w:line="276" w:lineRule="auto"/>
-            </w:pPr>
             <w:r>
-              <w:rPr>
-                <w:rFonts w:ascii="Calibri" w:hAnsi="Calibri"/>
-                <w:sz w:val="19"/>
-              </w:rPr>
               <w:t>D</w:t>
             </w:r>
           </w:p>
         </w:tc>
         <w:tc>
           <w:tcPr>
-            <w:tcW w:type="dxa" w:w="1900"/>
-            <w:vAlign w:val="center"/>
+            <w:tcW w:type="dxa" w:w="3360"/>
           </w:tcPr>
           <w:p>
-            <w:pPr>
-              <w:spacing w:after="0" w:line="276" w:lineRule="auto"/>
-            </w:pPr>
             <w:r>
-              <w:rPr>
-                <w:rFonts w:ascii="Calibri" w:hAnsi="Calibri"/>
-                <w:sz w:val="19"/>
-              </w:rPr>
               <w:t>description</w:t>
             </w:r>
           </w:p>
         </w:tc>
         <w:tc>
           <w:tcPr>
-            <w:tcW w:type="dxa" w:w="6560"/>
-            <w:vAlign w:val="center"/>
+            <w:tcW w:type="dxa" w:w="3360"/>
           </w:tcPr>
           <w:p>
-            <w:pPr>
-              <w:spacing w:after="0" w:line="276" w:lineRule="auto"/>
-            </w:pPr>
             <w:r>
-              <w:rPr>
-                <w:rFonts w:ascii="Calibri" w:hAnsi="Calibri"/>
-                <w:sz w:val="19"/>
-              </w:rPr>
-              <w:t>Use a concise product description from the product page. Remove boilerplate, storage instructions, checkout copy, and subscription logistics.</w:t>
+              <w:t>Use a concise product description from the listing. Remove boilerplate, checkout text, storage instructions, and subscription logistics.</w:t>
             </w:r>
           </w:p>
         </w:tc>
@@ -598,55 +415,31 @@
       <w:tr>
         <w:tc>
           <w:tcPr>
-            <w:tcW w:type="dxa" w:w="900"/>
-            <w:vAlign w:val="center"/>
+            <w:tcW w:type="dxa" w:w="3360"/>
           </w:tcPr>
           <w:p>
-            <w:pPr>
-              <w:spacing w:after="0" w:line="276" w:lineRule="auto"/>
-            </w:pPr>
             <w:r>
-              <w:rPr>
-                <w:rFonts w:ascii="Calibri" w:hAnsi="Calibri"/>
-                <w:sz w:val="19"/>
-              </w:rPr>
               <w:t>E</w:t>
             </w:r>
           </w:p>
         </w:tc>
         <w:tc>
           <w:tcPr>
-            <w:tcW w:type="dxa" w:w="1900"/>
-            <w:vAlign w:val="center"/>
+            <w:tcW w:type="dxa" w:w="3360"/>
           </w:tcPr>
           <w:p>
-            <w:pPr>
-              <w:spacing w:after="0" w:line="276" w:lineRule="auto"/>
-            </w:pPr>
             <w:r>
-              <w:rPr>
-                <w:rFonts w:ascii="Calibri" w:hAnsi="Calibri"/>
-                <w:sz w:val="19"/>
-              </w:rPr>
               <w:t>taste_notes</w:t>
             </w:r>
           </w:p>
         </w:tc>
         <w:tc>
           <w:tcPr>
-            <w:tcW w:type="dxa" w:w="6560"/>
-            <w:vAlign w:val="center"/>
+            <w:tcW w:type="dxa" w:w="3360"/>
           </w:tcPr>
           <w:p>
-            <w:pPr>
-              <w:spacing w:after="0" w:line="276" w:lineRule="auto"/>
-            </w:pPr>
             <w:r>
-              <w:rPr>
-                <w:rFonts w:ascii="Calibri" w:hAnsi="Calibri"/>
-                <w:sz w:val="19"/>
-              </w:rPr>
-              <w:t>Use the tasting notes exactly as listed, separated by commas. Convert plus signs to commas when the website uses plus signs as flavor separators.</w:t>
+              <w:t>Use only the exact short tasting notes from the listing, separated by commas. Do not copy origin/process/lot descriptions, brew guidance, marketing prose, or add your own words. Convert plus signs, slashes, bullets, or line breaks to commas only when they are flavor separators.</w:t>
             </w:r>
           </w:p>
         </w:tc>
@@ -654,55 +447,31 @@
       <w:tr>
         <w:tc>
           <w:tcPr>
-            <w:tcW w:type="dxa" w:w="900"/>
-            <w:vAlign w:val="center"/>
+            <w:tcW w:type="dxa" w:w="3360"/>
           </w:tcPr>
           <w:p>
-            <w:pPr>
-              <w:spacing w:after="0" w:line="276" w:lineRule="auto"/>
-            </w:pPr>
             <w:r>
-              <w:rPr>
-                <w:rFonts w:ascii="Calibri" w:hAnsi="Calibri"/>
-                <w:sz w:val="19"/>
-              </w:rPr>
               <w:t>F</w:t>
             </w:r>
           </w:p>
         </w:tc>
         <w:tc>
           <w:tcPr>
-            <w:tcW w:type="dxa" w:w="1900"/>
-            <w:vAlign w:val="center"/>
+            <w:tcW w:type="dxa" w:w="3360"/>
           </w:tcPr>
           <w:p>
-            <w:pPr>
-              <w:spacing w:after="0" w:line="276" w:lineRule="auto"/>
-            </w:pPr>
             <w:r>
-              <w:rPr>
-                <w:rFonts w:ascii="Calibri" w:hAnsi="Calibri"/>
-                <w:sz w:val="19"/>
-              </w:rPr>
               <w:t>taste_notes_category</w:t>
             </w:r>
           </w:p>
         </w:tc>
         <w:tc>
           <w:tcPr>
-            <w:tcW w:type="dxa" w:w="6560"/>
-            <w:vAlign w:val="center"/>
+            <w:tcW w:type="dxa" w:w="3360"/>
           </w:tcPr>
           <w:p>
-            <w:pPr>
-              <w:spacing w:after="0" w:line="276" w:lineRule="auto"/>
-            </w:pPr>
             <w:r>
-              <w:rPr>
-                <w:rFonts w:ascii="Calibri" w:hAnsi="Calibri"/>
-                <w:sz w:val="19"/>
-              </w:rPr>
-              <w:t>Use one or more fixed values from the Taste Notes Category list. Match capitalization and spelling exactly.</w:t>
+              <w:t>Use one or more fixed Taste Notes Category values. Match spelling and capitalization exactly.</w:t>
             </w:r>
           </w:p>
         </w:tc>
@@ -710,55 +479,31 @@
       <w:tr>
         <w:tc>
           <w:tcPr>
-            <w:tcW w:type="dxa" w:w="900"/>
-            <w:vAlign w:val="center"/>
+            <w:tcW w:type="dxa" w:w="3360"/>
           </w:tcPr>
           <w:p>
-            <w:pPr>
-              <w:spacing w:after="0" w:line="276" w:lineRule="auto"/>
-            </w:pPr>
             <w:r>
-              <w:rPr>
-                <w:rFonts w:ascii="Calibri" w:hAnsi="Calibri"/>
-                <w:sz w:val="19"/>
-              </w:rPr>
               <w:t>G</w:t>
             </w:r>
           </w:p>
         </w:tc>
         <w:tc>
           <w:tcPr>
-            <w:tcW w:type="dxa" w:w="1900"/>
-            <w:vAlign w:val="center"/>
+            <w:tcW w:type="dxa" w:w="3360"/>
           </w:tcPr>
           <w:p>
-            <w:pPr>
-              <w:spacing w:after="0" w:line="276" w:lineRule="auto"/>
-            </w:pPr>
             <w:r>
-              <w:rPr>
-                <w:rFonts w:ascii="Calibri" w:hAnsi="Calibri"/>
-                <w:sz w:val="19"/>
-              </w:rPr>
               <w:t>price_200g</w:t>
             </w:r>
           </w:p>
         </w:tc>
         <w:tc>
           <w:tcPr>
-            <w:tcW w:type="dxa" w:w="6560"/>
-            <w:vAlign w:val="center"/>
+            <w:tcW w:type="dxa" w:w="3360"/>
           </w:tcPr>
           <w:p>
-            <w:pPr>
-              <w:spacing w:after="0" w:line="276" w:lineRule="auto"/>
-            </w:pPr>
             <w:r>
-              <w:rPr>
-                <w:rFonts w:ascii="Calibri" w:hAnsi="Calibri"/>
-                <w:sz w:val="19"/>
-              </w:rPr>
-              <w:t>Normalize to the price for 200g. Use the formula listed in Section 5 and format as RM with two decimals unless the existing sheet uses another price format.</w:t>
+              <w:t>Numeric only, without RM or currency text. Normalize using Section 5.</w:t>
             </w:r>
           </w:p>
         </w:tc>
@@ -766,55 +511,31 @@
       <w:tr>
         <w:tc>
           <w:tcPr>
-            <w:tcW w:type="dxa" w:w="900"/>
-            <w:vAlign w:val="center"/>
+            <w:tcW w:type="dxa" w:w="3360"/>
           </w:tcPr>
           <w:p>
-            <w:pPr>
-              <w:spacing w:after="0" w:line="276" w:lineRule="auto"/>
-            </w:pPr>
             <w:r>
-              <w:rPr>
-                <w:rFonts w:ascii="Calibri" w:hAnsi="Calibri"/>
-                <w:sz w:val="19"/>
-              </w:rPr>
               <w:t>H</w:t>
             </w:r>
           </w:p>
         </w:tc>
         <w:tc>
           <w:tcPr>
-            <w:tcW w:type="dxa" w:w="1900"/>
-            <w:vAlign w:val="center"/>
+            <w:tcW w:type="dxa" w:w="3360"/>
           </w:tcPr>
           <w:p>
-            <w:pPr>
-              <w:spacing w:after="0" w:line="276" w:lineRule="auto"/>
-            </w:pPr>
             <w:r>
-              <w:rPr>
-                <w:rFonts w:ascii="Calibri" w:hAnsi="Calibri"/>
-                <w:sz w:val="19"/>
-              </w:rPr>
               <w:t>image_url</w:t>
             </w:r>
           </w:p>
         </w:tc>
         <w:tc>
           <w:tcPr>
-            <w:tcW w:type="dxa" w:w="6560"/>
-            <w:vAlign w:val="center"/>
+            <w:tcW w:type="dxa" w:w="3360"/>
           </w:tcPr>
           <w:p>
-            <w:pPr>
-              <w:spacing w:after="0" w:line="276" w:lineRule="auto"/>
-            </w:pPr>
             <w:r>
-              <w:rPr>
-                <w:rFonts w:ascii="Calibri" w:hAnsi="Calibri"/>
-                <w:sz w:val="19"/>
-              </w:rPr>
-              <w:t>Use the direct product image URL. If the URL begins with //, prefix it with https:.</w:t>
+              <w:t>Use the direct product image URL when available. Prefix URLs that begin with // using https:.</w:t>
             </w:r>
           </w:p>
         </w:tc>
@@ -822,55 +543,31 @@
       <w:tr>
         <w:tc>
           <w:tcPr>
-            <w:tcW w:type="dxa" w:w="900"/>
-            <w:vAlign w:val="center"/>
+            <w:tcW w:type="dxa" w:w="3360"/>
           </w:tcPr>
           <w:p>
-            <w:pPr>
-              <w:spacing w:after="0" w:line="276" w:lineRule="auto"/>
-            </w:pPr>
             <w:r>
-              <w:rPr>
-                <w:rFonts w:ascii="Calibri" w:hAnsi="Calibri"/>
-                <w:sz w:val="19"/>
-              </w:rPr>
               <w:t>I</w:t>
             </w:r>
           </w:p>
         </w:tc>
         <w:tc>
           <w:tcPr>
-            <w:tcW w:type="dxa" w:w="1900"/>
-            <w:vAlign w:val="center"/>
+            <w:tcW w:type="dxa" w:w="3360"/>
           </w:tcPr>
           <w:p>
-            <w:pPr>
-              <w:spacing w:after="0" w:line="276" w:lineRule="auto"/>
-            </w:pPr>
             <w:r>
-              <w:rPr>
-                <w:rFonts w:ascii="Calibri" w:hAnsi="Calibri"/>
-                <w:sz w:val="19"/>
-              </w:rPr>
               <w:t>varietal</w:t>
             </w:r>
           </w:p>
         </w:tc>
         <w:tc>
           <w:tcPr>
-            <w:tcW w:type="dxa" w:w="6560"/>
-            <w:vAlign w:val="center"/>
+            <w:tcW w:type="dxa" w:w="3360"/>
           </w:tcPr>
           <w:p>
-            <w:pPr>
-              <w:spacing w:after="0" w:line="276" w:lineRule="auto"/>
-            </w:pPr>
             <w:r>
-              <w:rPr>
-                <w:rFonts w:ascii="Calibri" w:hAnsi="Calibri"/>
-                <w:sz w:val="19"/>
-              </w:rPr>
-              <w:t>Use varietal/variety if explicitly listed. Do not infer unless obvious from the product title, such as Geisha or Pacamara.</w:t>
+              <w:t>Use varietal/variety only if explicitly listed or clearly present in the product title, such as Geisha or Pacamara.</w:t>
             </w:r>
           </w:p>
         </w:tc>
@@ -878,55 +575,31 @@
       <w:tr>
         <w:tc>
           <w:tcPr>
-            <w:tcW w:type="dxa" w:w="900"/>
-            <w:vAlign w:val="center"/>
+            <w:tcW w:type="dxa" w:w="3360"/>
           </w:tcPr>
           <w:p>
-            <w:pPr>
-              <w:spacing w:after="0" w:line="276" w:lineRule="auto"/>
-            </w:pPr>
             <w:r>
-              <w:rPr>
-                <w:rFonts w:ascii="Calibri" w:hAnsi="Calibri"/>
-                <w:sz w:val="19"/>
-              </w:rPr>
               <w:t>J</w:t>
             </w:r>
           </w:p>
         </w:tc>
         <w:tc>
           <w:tcPr>
-            <w:tcW w:type="dxa" w:w="1900"/>
-            <w:vAlign w:val="center"/>
+            <w:tcW w:type="dxa" w:w="3360"/>
           </w:tcPr>
           <w:p>
-            <w:pPr>
-              <w:spacing w:after="0" w:line="276" w:lineRule="auto"/>
-            </w:pPr>
             <w:r>
-              <w:rPr>
-                <w:rFonts w:ascii="Calibri" w:hAnsi="Calibri"/>
-                <w:sz w:val="19"/>
-              </w:rPr>
               <w:t>altitude</w:t>
             </w:r>
           </w:p>
         </w:tc>
         <w:tc>
           <w:tcPr>
-            <w:tcW w:type="dxa" w:w="6560"/>
-            <w:vAlign w:val="center"/>
+            <w:tcW w:type="dxa" w:w="3360"/>
           </w:tcPr>
           <w:p>
-            <w:pPr>
-              <w:spacing w:after="0" w:line="276" w:lineRule="auto"/>
-            </w:pPr>
             <w:r>
-              <w:rPr>
-                <w:rFonts w:ascii="Calibri" w:hAnsi="Calibri"/>
-                <w:sz w:val="19"/>
-              </w:rPr>
-              <w:t>Use altitude/elevation if listed. Preserve the unit and range.</w:t>
+              <w:t>Use altitude/elevation only if listed. Preserve unit and range.</w:t>
             </w:r>
           </w:p>
         </w:tc>
@@ -934,55 +607,31 @@
       <w:tr>
         <w:tc>
           <w:tcPr>
-            <w:tcW w:type="dxa" w:w="900"/>
-            <w:vAlign w:val="center"/>
+            <w:tcW w:type="dxa" w:w="3360"/>
           </w:tcPr>
           <w:p>
-            <w:pPr>
-              <w:spacing w:after="0" w:line="276" w:lineRule="auto"/>
-            </w:pPr>
             <w:r>
-              <w:rPr>
-                <w:rFonts w:ascii="Calibri" w:hAnsi="Calibri"/>
-                <w:sz w:val="19"/>
-              </w:rPr>
               <w:t>K</w:t>
             </w:r>
           </w:p>
         </w:tc>
         <w:tc>
           <w:tcPr>
-            <w:tcW w:type="dxa" w:w="1900"/>
-            <w:vAlign w:val="center"/>
+            <w:tcW w:type="dxa" w:w="3360"/>
           </w:tcPr>
           <w:p>
-            <w:pPr>
-              <w:spacing w:after="0" w:line="276" w:lineRule="auto"/>
-            </w:pPr>
             <w:r>
-              <w:rPr>
-                <w:rFonts w:ascii="Calibri" w:hAnsi="Calibri"/>
-                <w:sz w:val="19"/>
-              </w:rPr>
               <w:t>processing method</w:t>
             </w:r>
           </w:p>
         </w:tc>
         <w:tc>
           <w:tcPr>
-            <w:tcW w:type="dxa" w:w="6560"/>
-            <w:vAlign w:val="center"/>
+            <w:tcW w:type="dxa" w:w="3360"/>
           </w:tcPr>
           <w:p>
-            <w:pPr>
-              <w:spacing w:after="0" w:line="276" w:lineRule="auto"/>
-            </w:pPr>
             <w:r>
-              <w:rPr>
-                <w:rFonts w:ascii="Calibri" w:hAnsi="Calibri"/>
-                <w:sz w:val="19"/>
-              </w:rPr>
-              <w:t>Use the listed process, such as Washed, Natural, Honey, Anaerobic Natural, or Wet-hulled.</w:t>
+              <w:t>Use the listed process, such as Washed, Natural, Honey, Anaerobic Natural, Carbonic Maceration, or Wet-hulled.</w:t>
             </w:r>
           </w:p>
         </w:tc>
@@ -990,55 +639,31 @@
       <w:tr>
         <w:tc>
           <w:tcPr>
-            <w:tcW w:type="dxa" w:w="900"/>
-            <w:vAlign w:val="center"/>
+            <w:tcW w:type="dxa" w:w="3360"/>
           </w:tcPr>
           <w:p>
-            <w:pPr>
-              <w:spacing w:after="0" w:line="276" w:lineRule="auto"/>
-            </w:pPr>
             <w:r>
-              <w:rPr>
-                <w:rFonts w:ascii="Calibri" w:hAnsi="Calibri"/>
-                <w:sz w:val="19"/>
-              </w:rPr>
               <w:t>L</w:t>
             </w:r>
           </w:p>
         </w:tc>
         <w:tc>
           <w:tcPr>
-            <w:tcW w:type="dxa" w:w="1900"/>
-            <w:vAlign w:val="center"/>
+            <w:tcW w:type="dxa" w:w="3360"/>
           </w:tcPr>
           <w:p>
-            <w:pPr>
-              <w:spacing w:after="0" w:line="276" w:lineRule="auto"/>
-            </w:pPr>
             <w:r>
-              <w:rPr>
-                <w:rFonts w:ascii="Calibri" w:hAnsi="Calibri"/>
-                <w:sz w:val="19"/>
-              </w:rPr>
               <w:t>roast level</w:t>
             </w:r>
           </w:p>
         </w:tc>
         <w:tc>
           <w:tcPr>
-            <w:tcW w:type="dxa" w:w="6560"/>
-            <w:vAlign w:val="center"/>
+            <w:tcW w:type="dxa" w:w="3360"/>
           </w:tcPr>
           <w:p>
-            <w:pPr>
-              <w:spacing w:after="0" w:line="276" w:lineRule="auto"/>
-            </w:pPr>
             <w:r>
-              <w:rPr>
-                <w:rFonts w:ascii="Calibri" w:hAnsi="Calibri"/>
-                <w:sz w:val="19"/>
-              </w:rPr>
-              <w:t>Use only the fixed Roast Level values. If not listed or confidently inferable, use Unknown or leave blank if the sheet convention is blank.</w:t>
+              <w:t>Use only the fixed Roast Level values. If the roast level is not explicitly stated, use Unknown. Do not infer from taste notes, brew method, or origin.</w:t>
             </w:r>
           </w:p>
         </w:tc>
@@ -1046,55 +671,31 @@
       <w:tr>
         <w:tc>
           <w:tcPr>
-            <w:tcW w:type="dxa" w:w="900"/>
-            <w:vAlign w:val="center"/>
+            <w:tcW w:type="dxa" w:w="3360"/>
           </w:tcPr>
           <w:p>
-            <w:pPr>
-              <w:spacing w:after="0" w:line="276" w:lineRule="auto"/>
-            </w:pPr>
             <w:r>
-              <w:rPr>
-                <w:rFonts w:ascii="Calibri" w:hAnsi="Calibri"/>
-                <w:sz w:val="19"/>
-              </w:rPr>
               <w:t>M</w:t>
             </w:r>
           </w:p>
         </w:tc>
         <w:tc>
           <w:tcPr>
-            <w:tcW w:type="dxa" w:w="1900"/>
-            <w:vAlign w:val="center"/>
+            <w:tcW w:type="dxa" w:w="3360"/>
           </w:tcPr>
           <w:p>
-            <w:pPr>
-              <w:spacing w:after="0" w:line="276" w:lineRule="auto"/>
-            </w:pPr>
             <w:r>
-              <w:rPr>
-                <w:rFonts w:ascii="Calibri" w:hAnsi="Calibri"/>
-                <w:sz w:val="19"/>
-              </w:rPr>
               <w:t>roasted for</w:t>
             </w:r>
           </w:p>
         </w:tc>
         <w:tc>
           <w:tcPr>
-            <w:tcW w:type="dxa" w:w="6560"/>
-            <w:vAlign w:val="center"/>
+            <w:tcW w:type="dxa" w:w="3360"/>
           </w:tcPr>
           <w:p>
-            <w:pPr>
-              <w:spacing w:after="0" w:line="276" w:lineRule="auto"/>
-            </w:pPr>
             <w:r>
-              <w:rPr>
-                <w:rFonts w:ascii="Calibri" w:hAnsi="Calibri"/>
-                <w:sz w:val="19"/>
-              </w:rPr>
-              <w:t>Use only Espresso, Filter, or Both. Use Both when the site says Omni or explicitly says the bean is suitable for both filter and espresso.</w:t>
+              <w:t>Use Espresso, Filter, or Both. Use Both only when the listing says Omni, espresso and filter, or otherwise clearly supports both.</w:t>
             </w:r>
           </w:p>
         </w:tc>
@@ -1102,55 +703,31 @@
       <w:tr>
         <w:tc>
           <w:tcPr>
-            <w:tcW w:type="dxa" w:w="900"/>
-            <w:vAlign w:val="center"/>
+            <w:tcW w:type="dxa" w:w="3360"/>
           </w:tcPr>
           <w:p>
-            <w:pPr>
-              <w:spacing w:after="0" w:line="276" w:lineRule="auto"/>
-            </w:pPr>
             <w:r>
-              <w:rPr>
-                <w:rFonts w:ascii="Calibri" w:hAnsi="Calibri"/>
-                <w:sz w:val="19"/>
-              </w:rPr>
               <w:t>N</w:t>
             </w:r>
           </w:p>
         </w:tc>
         <w:tc>
           <w:tcPr>
-            <w:tcW w:type="dxa" w:w="1900"/>
-            <w:vAlign w:val="center"/>
+            <w:tcW w:type="dxa" w:w="3360"/>
           </w:tcPr>
           <w:p>
-            <w:pPr>
-              <w:spacing w:after="0" w:line="276" w:lineRule="auto"/>
-            </w:pPr>
             <w:r>
-              <w:rPr>
-                <w:rFonts w:ascii="Calibri" w:hAnsi="Calibri"/>
-                <w:sz w:val="19"/>
-              </w:rPr>
               <w:t>origin</w:t>
             </w:r>
           </w:p>
         </w:tc>
         <w:tc>
           <w:tcPr>
-            <w:tcW w:type="dxa" w:w="6560"/>
-            <w:vAlign w:val="center"/>
+            <w:tcW w:type="dxa" w:w="3360"/>
           </w:tcPr>
           <w:p>
-            <w:pPr>
-              <w:spacing w:after="0" w:line="276" w:lineRule="auto"/>
-            </w:pPr>
             <w:r>
-              <w:rPr>
-                <w:rFonts w:ascii="Calibri" w:hAnsi="Calibri"/>
-                <w:sz w:val="19"/>
-              </w:rPr>
-              <w:t>Use only fixed Origin values. Multiple origins are allowed. Correct spelling such as Columbia -&gt; Colombia.</w:t>
+              <w:t>Use fixed Origin values. Multiple origins are allowed for confirmed blends; separate countries with commas. Correct spelling such as Columbia -&gt; Colombia.</w:t>
             </w:r>
           </w:p>
         </w:tc>
@@ -1158,55 +735,31 @@
       <w:tr>
         <w:tc>
           <w:tcPr>
-            <w:tcW w:type="dxa" w:w="900"/>
-            <w:vAlign w:val="center"/>
+            <w:tcW w:type="dxa" w:w="3360"/>
           </w:tcPr>
           <w:p>
-            <w:pPr>
-              <w:spacing w:after="0" w:line="276" w:lineRule="auto"/>
-            </w:pPr>
             <w:r>
-              <w:rPr>
-                <w:rFonts w:ascii="Calibri" w:hAnsi="Calibri"/>
-                <w:sz w:val="19"/>
-              </w:rPr>
               <w:t>O</w:t>
             </w:r>
           </w:p>
         </w:tc>
         <w:tc>
           <w:tcPr>
-            <w:tcW w:type="dxa" w:w="1900"/>
-            <w:vAlign w:val="center"/>
+            <w:tcW w:type="dxa" w:w="3360"/>
           </w:tcPr>
           <w:p>
-            <w:pPr>
-              <w:spacing w:after="0" w:line="276" w:lineRule="auto"/>
-            </w:pPr>
             <w:r>
-              <w:rPr>
-                <w:rFonts w:ascii="Calibri" w:hAnsi="Calibri"/>
-                <w:sz w:val="19"/>
-              </w:rPr>
               <w:t>blend</w:t>
             </w:r>
           </w:p>
         </w:tc>
         <w:tc>
           <w:tcPr>
-            <w:tcW w:type="dxa" w:w="6560"/>
-            <w:vAlign w:val="center"/>
+            <w:tcW w:type="dxa" w:w="3360"/>
           </w:tcPr>
           <w:p>
-            <w:pPr>
-              <w:spacing w:after="0" w:line="276" w:lineRule="auto"/>
-            </w:pPr>
             <w:r>
-              <w:rPr>
-                <w:rFonts w:ascii="Calibri" w:hAnsi="Calibri"/>
-                <w:sz w:val="19"/>
-              </w:rPr>
-              <w:t>Use only Yes or No. Yes for blends, house blends, multi-origin products, or branded blend names. No for single-origin listings.</w:t>
+              <w:t>Use Yes for blends, house blends, multi-origin products, or branded blend names. Use No for single-origin listings.</w:t>
             </w:r>
           </w:p>
         </w:tc>
@@ -1214,76 +767,59 @@
       <w:tr>
         <w:tc>
           <w:tcPr>
-            <w:tcW w:type="dxa" w:w="900"/>
-            <w:vAlign w:val="center"/>
+            <w:tcW w:type="dxa" w:w="3360"/>
           </w:tcPr>
           <w:p>
-            <w:pPr>
-              <w:spacing w:after="0" w:line="276" w:lineRule="auto"/>
-            </w:pPr>
             <w:r>
-              <w:rPr>
-                <w:rFonts w:ascii="Calibri" w:hAnsi="Calibri"/>
-                <w:sz w:val="19"/>
-              </w:rPr>
               <w:t>P</w:t>
             </w:r>
           </w:p>
         </w:tc>
         <w:tc>
           <w:tcPr>
-            <w:tcW w:type="dxa" w:w="1900"/>
-            <w:vAlign w:val="center"/>
+            <w:tcW w:type="dxa" w:w="3360"/>
           </w:tcPr>
           <w:p>
-            <w:pPr>
-              <w:spacing w:after="0" w:line="276" w:lineRule="auto"/>
-            </w:pPr>
             <w:r>
-              <w:rPr>
-                <w:rFonts w:ascii="Calibri" w:hAnsi="Calibri"/>
-                <w:sz w:val="19"/>
-              </w:rPr>
               <w:t>link</w:t>
             </w:r>
           </w:p>
         </w:tc>
         <w:tc>
           <w:tcPr>
-            <w:tcW w:type="dxa" w:w="6560"/>
-            <w:vAlign w:val="center"/>
+            <w:tcW w:type="dxa" w:w="3360"/>
           </w:tcPr>
           <w:p>
-            <w:pPr>
-              <w:spacing w:after="0" w:line="276" w:lineRule="auto"/>
-            </w:pPr>
             <w:r>
-              <w:rPr>
-                <w:rFonts w:ascii="Calibri" w:hAnsi="Calibri"/>
-                <w:sz w:val="19"/>
-              </w:rPr>
               <w:t>Use the full product page URL.</w:t>
             </w:r>
           </w:p>
         </w:tc>
       </w:tr>
     </w:tbl>
+    <w:p/>
     <w:p>
       <w:pPr>
         <w:pStyle w:val="Heading1"/>
+        <w:spacing w:before="160" w:after="80"/>
       </w:pPr>
       <w:r>
         <w:t>5. Price Normalization</w:t>
       </w:r>
     </w:p>
     <w:p>
+      <w:pPr>
+        <w:pStyle w:val="ListBullet"/>
+        <w:spacing w:after="20"/>
+      </w:pPr>
       <w:r>
-        <w:t>Always fill price_200g as the equivalent price for 200g, even when the website sells 80g, 125g, 250g, 300g, 500g, or 1kg.</w:t>
+        <w:t>Always fill price_200g as the equivalent price for 200g.</w:t>
       </w:r>
     </w:p>
     <w:p>
       <w:pPr>
         <w:pStyle w:val="ListBullet"/>
+        <w:spacing w:after="20"/>
       </w:pPr>
       <w:r>
         <w:t>Formula: price_200g = listed_price / listed_weight_in_grams * 200.</w:t>
@@ -1292,38 +828,25 @@
     <w:p>
       <w:pPr>
         <w:pStyle w:val="ListBullet"/>
+        <w:spacing w:after="20"/>
       </w:pPr>
       <w:r>
-        <w:t>Example: RM75 for 500g becomes RM30.00 for 200g.</w:t>
+        <w:t>If a 200g variant exists, use that price directly.</w:t>
       </w:r>
     </w:p>
     <w:p>
       <w:pPr>
         <w:pStyle w:val="ListBullet"/>
+        <w:spacing w:after="20"/>
       </w:pPr>
       <w:r>
-        <w:t>Example: RM105 for 125g becomes RM168.00 for 200g.</w:t>
+        <w:t>If no 200g variant exists, choose the best available bean variant in this order: 250g, 300g, 500g, 1kg, then smaller specialty sizes such as 150g, 125g, 100g, or 80g.</w:t>
       </w:r>
     </w:p>
     <w:p>
       <w:pPr>
         <w:pStyle w:val="ListBullet"/>
-      </w:pPr>
-      <w:r>
-        <w:t>If the product has a 200g variant, use the 200g price directly.</w:t>
-      </w:r>
-    </w:p>
-    <w:p>
-      <w:pPr>
-        <w:pStyle w:val="ListBullet"/>
-      </w:pPr>
-      <w:r>
-        <w:t>If there is no 200g variant, choose the best available bean variant in this order: 250g, 300g, 500g, 1kg, then smaller specialty sizes such as 125g or 80g.</w:t>
-      </w:r>
-    </w:p>
-    <w:p>
-      <w:pPr>
-        <w:pStyle w:val="ListBullet"/>
+        <w:spacing w:after="20"/>
       </w:pPr>
       <w:r>
         <w:t>Prefer Whole Bean over ground variants when both have the same weight.</w:t>
@@ -1332,27 +855,39 @@
     <w:p>
       <w:pPr>
         <w:pStyle w:val="ListBullet"/>
+        <w:spacing w:after="20"/>
       </w:pPr>
       <w:r>
-        <w:t>For subscriptions, divide total price by the total number of bags first, then prorate to 200g. Example: 6 months x 1 bag/month at 200g means divide by 6.</w:t>
+        <w:t>Use the actual sale/current listed price when a sale price is clearly active. Otherwise use the normal listed price.</w:t>
+      </w:r>
+    </w:p>
+    <w:p>
+      <w:pPr>
+        <w:pStyle w:val="ListBullet"/>
+        <w:spacing w:after="20"/>
+      </w:pPr>
+      <w:r>
+        <w:t>Do not use shipping weight, package dimensions, or subscription total weight unless the listing itself identifies that as the coffee weight.</w:t>
       </w:r>
     </w:p>
     <w:p>
       <w:pPr>
         <w:pStyle w:val="Heading1"/>
+        <w:spacing w:before="160" w:after="80"/>
       </w:pPr>
       <w:r>
-        <w:t>6. Fixed Validation Values</w:t>
+        <w:t>6. Fixed Values</w:t>
       </w:r>
     </w:p>
     <w:p>
       <w:r>
-        <w:t>For the columns below, use only these values. Do not invent synonyms. If a website uses a different phrase, map it to the closest fixed value only when the meaning is clear.</w:t>
+        <w:t>Use only the values below for controlled columns. For origin, comma-separated multiple fixed values are allowed only for confirmed blends.</w:t>
       </w:r>
     </w:p>
     <w:p>
       <w:pPr>
-        <w:pStyle w:val="Heading3"/>
+        <w:pStyle w:val="Heading2"/>
+        <w:spacing w:before="160" w:after="80"/>
       </w:pPr>
       <w:r>
         <w:t>taste_notes_category</w:t>
@@ -1361,76 +896,41 @@
     <w:tbl>
       <w:tblPr>
         <w:tblStyle w:val="TableGrid"/>
-        <w:tblW w:type="dxa" w:w="9360"/>
-        <w:jc w:val="left"/>
-        <w:tblLayout w:type="fixed"/>
+        <w:tblW w:type="auto" w:w="0"/>
         <w:tblLook w:firstColumn="1" w:firstRow="1" w:lastColumn="0" w:lastRow="0" w:noHBand="0" w:noVBand="1" w:val="04A0"/>
       </w:tblPr>
       <w:tblGrid>
-        <w:gridCol w:w="3120"/>
-        <w:gridCol w:w="3120"/>
-        <w:gridCol w:w="3120"/>
+        <w:gridCol w:w="3360"/>
+        <w:gridCol w:w="3360"/>
+        <w:gridCol w:w="3360"/>
       </w:tblGrid>
       <w:tr>
         <w:tc>
           <w:tcPr>
-            <w:tcW w:type="dxa" w:w="3120"/>
-            <w:vAlign w:val="center"/>
-            <w:shd w:fill="FFFFFF"/>
+            <w:tcW w:type="dxa" w:w="3360"/>
           </w:tcPr>
           <w:p>
-            <w:pPr>
-              <w:spacing w:after="0" w:line="276" w:lineRule="auto"/>
-            </w:pPr>
             <w:r>
-              <w:rPr>
-                <w:rFonts w:ascii="Calibri" w:hAnsi="Calibri"/>
-                <w:b/>
-                <w:color w:val="1F4D78"/>
-                <w:sz w:val="19"/>
-              </w:rPr>
               <w:t>Fruity</w:t>
             </w:r>
           </w:p>
         </w:tc>
         <w:tc>
           <w:tcPr>
-            <w:tcW w:type="dxa" w:w="3120"/>
-            <w:vAlign w:val="center"/>
-            <w:shd w:fill="FFFFFF"/>
+            <w:tcW w:type="dxa" w:w="3360"/>
           </w:tcPr>
           <w:p>
-            <w:pPr>
-              <w:spacing w:after="0" w:line="276" w:lineRule="auto"/>
-            </w:pPr>
             <w:r>
-              <w:rPr>
-                <w:rFonts w:ascii="Calibri" w:hAnsi="Calibri"/>
-                <w:b/>
-                <w:color w:val="1F4D78"/>
-                <w:sz w:val="19"/>
-              </w:rPr>
               <w:t>Sour/Fermented</w:t>
             </w:r>
           </w:p>
         </w:tc>
         <w:tc>
           <w:tcPr>
-            <w:tcW w:type="dxa" w:w="3120"/>
-            <w:vAlign w:val="center"/>
-            <w:shd w:fill="FFFFFF"/>
+            <w:tcW w:type="dxa" w:w="3360"/>
           </w:tcPr>
           <w:p>
-            <w:pPr>
-              <w:spacing w:after="0" w:line="276" w:lineRule="auto"/>
-            </w:pPr>
             <w:r>
-              <w:rPr>
-                <w:rFonts w:ascii="Calibri" w:hAnsi="Calibri"/>
-                <w:b/>
-                <w:color w:val="1F4D78"/>
-                <w:sz w:val="19"/>
-              </w:rPr>
               <w:t>Green/Vegetative</w:t>
             </w:r>
           </w:p>
@@ -1439,54 +939,30 @@
       <w:tr>
         <w:tc>
           <w:tcPr>
-            <w:tcW w:type="dxa" w:w="3120"/>
-            <w:vAlign w:val="center"/>
+            <w:tcW w:type="dxa" w:w="3360"/>
           </w:tcPr>
           <w:p>
-            <w:pPr>
-              <w:spacing w:after="0" w:line="276" w:lineRule="auto"/>
-            </w:pPr>
             <w:r>
-              <w:rPr>
-                <w:rFonts w:ascii="Calibri" w:hAnsi="Calibri"/>
-                <w:sz w:val="19"/>
-              </w:rPr>
               <w:t>Roasted</w:t>
             </w:r>
           </w:p>
         </w:tc>
         <w:tc>
           <w:tcPr>
-            <w:tcW w:type="dxa" w:w="3120"/>
-            <w:vAlign w:val="center"/>
+            <w:tcW w:type="dxa" w:w="3360"/>
           </w:tcPr>
           <w:p>
-            <w:pPr>
-              <w:spacing w:after="0" w:line="276" w:lineRule="auto"/>
-            </w:pPr>
             <w:r>
-              <w:rPr>
-                <w:rFonts w:ascii="Calibri" w:hAnsi="Calibri"/>
-                <w:sz w:val="19"/>
-              </w:rPr>
               <w:t>Spices</w:t>
             </w:r>
           </w:p>
         </w:tc>
         <w:tc>
           <w:tcPr>
-            <w:tcW w:type="dxa" w:w="3120"/>
-            <w:vAlign w:val="center"/>
+            <w:tcW w:type="dxa" w:w="3360"/>
           </w:tcPr>
           <w:p>
-            <w:pPr>
-              <w:spacing w:after="0" w:line="276" w:lineRule="auto"/>
-            </w:pPr>
             <w:r>
-              <w:rPr>
-                <w:rFonts w:ascii="Calibri" w:hAnsi="Calibri"/>
-                <w:sz w:val="19"/>
-              </w:rPr>
               <w:t>Nutty/Cocoa</w:t>
             </w:r>
           </w:p>
@@ -1495,63 +971,41 @@
       <w:tr>
         <w:tc>
           <w:tcPr>
-            <w:tcW w:type="dxa" w:w="3120"/>
-            <w:vAlign w:val="center"/>
+            <w:tcW w:type="dxa" w:w="3360"/>
           </w:tcPr>
           <w:p>
-            <w:pPr>
-              <w:spacing w:after="0" w:line="276" w:lineRule="auto"/>
-            </w:pPr>
             <w:r>
-              <w:rPr>
-                <w:rFonts w:ascii="Calibri" w:hAnsi="Calibri"/>
-                <w:sz w:val="19"/>
-              </w:rPr>
               <w:t>Sweet</w:t>
             </w:r>
           </w:p>
         </w:tc>
         <w:tc>
           <w:tcPr>
-            <w:tcW w:type="dxa" w:w="3120"/>
-            <w:vAlign w:val="center"/>
+            <w:tcW w:type="dxa" w:w="3360"/>
           </w:tcPr>
           <w:p>
-            <w:pPr>
-              <w:spacing w:after="0" w:line="276" w:lineRule="auto"/>
-            </w:pPr>
             <w:r>
-              <w:rPr>
-                <w:rFonts w:ascii="Calibri" w:hAnsi="Calibri"/>
-                <w:sz w:val="19"/>
-              </w:rPr>
               <w:t>Floral</w:t>
             </w:r>
           </w:p>
         </w:tc>
         <w:tc>
           <w:tcPr>
-            <w:tcW w:type="dxa" w:w="3120"/>
-            <w:vAlign w:val="center"/>
+            <w:tcW w:type="dxa" w:w="3360"/>
           </w:tcPr>
           <w:p>
-            <w:pPr>
-              <w:spacing w:after="0" w:line="276" w:lineRule="auto"/>
-            </w:pPr>
             <w:r>
-              <w:rPr>
-                <w:rFonts w:ascii="Calibri" w:hAnsi="Calibri"/>
-                <w:sz w:val="19"/>
-              </w:rPr>
               <w:t>Other</w:t>
             </w:r>
           </w:p>
         </w:tc>
       </w:tr>
     </w:tbl>
+    <w:p/>
     <w:p>
       <w:pPr>
-        <w:pStyle w:val="Heading3"/>
+        <w:pStyle w:val="Heading2"/>
+        <w:spacing w:before="160" w:after="80"/>
       </w:pPr>
       <w:r>
         <w:t>roast level</w:t>
@@ -1560,55 +1014,42 @@
     <w:tbl>
       <w:tblPr>
         <w:tblStyle w:val="TableGrid"/>
-        <w:tblW w:type="dxa" w:w="9360"/>
-        <w:jc w:val="left"/>
-        <w:tblLayout w:type="fixed"/>
+        <w:tblW w:type="auto" w:w="0"/>
         <w:tblLook w:firstColumn="1" w:firstRow="1" w:lastColumn="0" w:lastRow="0" w:noHBand="0" w:noVBand="1" w:val="04A0"/>
       </w:tblPr>
       <w:tblGrid>
-        <w:gridCol w:w="4680"/>
-        <w:gridCol w:w="4680"/>
+        <w:gridCol w:w="3360"/>
+        <w:gridCol w:w="3360"/>
+        <w:gridCol w:w="3360"/>
       </w:tblGrid>
       <w:tr>
         <w:tc>
           <w:tcPr>
-            <w:tcW w:type="dxa" w:w="4680"/>
-            <w:vAlign w:val="center"/>
-            <w:shd w:fill="FFFFFF"/>
+            <w:tcW w:type="dxa" w:w="3360"/>
           </w:tcPr>
           <w:p>
-            <w:pPr>
-              <w:spacing w:after="0" w:line="276" w:lineRule="auto"/>
-            </w:pPr>
             <w:r>
-              <w:rPr>
-                <w:rFonts w:ascii="Calibri" w:hAnsi="Calibri"/>
-                <w:b/>
-                <w:color w:val="1F4D78"/>
-                <w:sz w:val="19"/>
-              </w:rPr>
               <w:t>Light</w:t>
             </w:r>
           </w:p>
         </w:tc>
         <w:tc>
           <w:tcPr>
-            <w:tcW w:type="dxa" w:w="4680"/>
-            <w:vAlign w:val="center"/>
-            <w:shd w:fill="FFFFFF"/>
+            <w:tcW w:type="dxa" w:w="3360"/>
           </w:tcPr>
           <w:p>
-            <w:pPr>
-              <w:spacing w:after="0" w:line="276" w:lineRule="auto"/>
-            </w:pPr>
             <w:r>
-              <w:rPr>
-                <w:rFonts w:ascii="Calibri" w:hAnsi="Calibri"/>
-                <w:b/>
-                <w:color w:val="1F4D78"/>
-                <w:sz w:val="19"/>
-              </w:rPr>
               <w:t>Medium Light</w:t>
+            </w:r>
+          </w:p>
+        </w:tc>
+        <w:tc>
+          <w:tcPr>
+            <w:tcW w:type="dxa" w:w="3360"/>
+          </w:tcPr>
+          <w:p>
+            <w:r>
+              <w:t>Medium</w:t>
             </w:r>
           </w:p>
         </w:tc>
@@ -1616,74 +1057,30 @@
       <w:tr>
         <w:tc>
           <w:tcPr>
-            <w:tcW w:type="dxa" w:w="4680"/>
-            <w:vAlign w:val="center"/>
+            <w:tcW w:type="dxa" w:w="3360"/>
           </w:tcPr>
           <w:p>
-            <w:pPr>
-              <w:spacing w:after="0" w:line="276" w:lineRule="auto"/>
-            </w:pPr>
             <w:r>
-              <w:rPr>
-                <w:rFonts w:ascii="Calibri" w:hAnsi="Calibri"/>
-                <w:sz w:val="19"/>
-              </w:rPr>
-              <w:t>Medium</w:t>
+              <w:t>Medium-Dark</w:t>
             </w:r>
           </w:p>
         </w:tc>
         <w:tc>
           <w:tcPr>
-            <w:tcW w:type="dxa" w:w="4680"/>
-            <w:vAlign w:val="center"/>
+            <w:tcW w:type="dxa" w:w="3360"/>
           </w:tcPr>
           <w:p>
-            <w:pPr>
-              <w:spacing w:after="0" w:line="276" w:lineRule="auto"/>
-            </w:pPr>
             <w:r>
-              <w:rPr>
-                <w:rFonts w:ascii="Calibri" w:hAnsi="Calibri"/>
-                <w:sz w:val="19"/>
-              </w:rPr>
-              <w:t>Medium-Dark</w:t>
-            </w:r>
-          </w:p>
-        </w:tc>
-      </w:tr>
-      <w:tr>
-        <w:tc>
-          <w:tcPr>
-            <w:tcW w:type="dxa" w:w="4680"/>
-            <w:vAlign w:val="center"/>
-          </w:tcPr>
-          <w:p>
-            <w:pPr>
-              <w:spacing w:after="0" w:line="276" w:lineRule="auto"/>
-            </w:pPr>
-            <w:r>
-              <w:rPr>
-                <w:rFonts w:ascii="Calibri" w:hAnsi="Calibri"/>
-                <w:sz w:val="19"/>
-              </w:rPr>
               <w:t>Dark</w:t>
             </w:r>
           </w:p>
         </w:tc>
         <w:tc>
           <w:tcPr>
-            <w:tcW w:type="dxa" w:w="4680"/>
-            <w:vAlign w:val="center"/>
+            <w:tcW w:type="dxa" w:w="3360"/>
           </w:tcPr>
           <w:p>
-            <w:pPr>
-              <w:spacing w:after="0" w:line="276" w:lineRule="auto"/>
-            </w:pPr>
             <w:r>
-              <w:rPr>
-                <w:rFonts w:ascii="Calibri" w:hAnsi="Calibri"/>
-                <w:sz w:val="19"/>
-              </w:rPr>
               <w:t>Unroasted</w:t>
             </w:r>
           </w:p>
@@ -1692,38 +1089,37 @@
       <w:tr>
         <w:tc>
           <w:tcPr>
-            <w:tcW w:type="dxa" w:w="4680"/>
-            <w:vAlign w:val="center"/>
+            <w:tcW w:type="dxa" w:w="3360"/>
           </w:tcPr>
           <w:p>
-            <w:pPr>
-              <w:spacing w:after="0" w:line="276" w:lineRule="auto"/>
-            </w:pPr>
             <w:r>
-              <w:rPr>
-                <w:rFonts w:ascii="Calibri" w:hAnsi="Calibri"/>
-                <w:sz w:val="19"/>
-              </w:rPr>
               <w:t>Unknown</w:t>
             </w:r>
           </w:p>
         </w:tc>
         <w:tc>
           <w:tcPr>
-            <w:tcW w:type="dxa" w:w="4680"/>
-            <w:vAlign w:val="center"/>
+            <w:tcW w:type="dxa" w:w="3360"/>
           </w:tcPr>
           <w:p>
-            <w:pPr>
-              <w:spacing w:after="0" w:line="276" w:lineRule="auto"/>
-            </w:pPr>
+            <w:r/>
+          </w:p>
+        </w:tc>
+        <w:tc>
+          <w:tcPr>
+            <w:tcW w:type="dxa" w:w="3360"/>
+          </w:tcPr>
+          <w:p>
+            <w:r/>
           </w:p>
         </w:tc>
       </w:tr>
     </w:tbl>
+    <w:p/>
     <w:p>
       <w:pPr>
-        <w:pStyle w:val="Heading3"/>
+        <w:pStyle w:val="Heading2"/>
+        <w:spacing w:before="160" w:after="80"/>
       </w:pPr>
       <w:r>
         <w:t>roasted for</w:t>
@@ -1732,85 +1128,52 @@
     <w:tbl>
       <w:tblPr>
         <w:tblStyle w:val="TableGrid"/>
-        <w:tblW w:type="dxa" w:w="9360"/>
-        <w:jc w:val="left"/>
-        <w:tblLayout w:type="fixed"/>
+        <w:tblW w:type="auto" w:w="0"/>
         <w:tblLook w:firstColumn="1" w:firstRow="1" w:lastColumn="0" w:lastRow="0" w:noHBand="0" w:noVBand="1" w:val="04A0"/>
       </w:tblPr>
       <w:tblGrid>
-        <w:gridCol w:w="3120"/>
-        <w:gridCol w:w="3120"/>
-        <w:gridCol w:w="3120"/>
+        <w:gridCol w:w="3360"/>
+        <w:gridCol w:w="3360"/>
+        <w:gridCol w:w="3360"/>
       </w:tblGrid>
       <w:tr>
         <w:tc>
           <w:tcPr>
-            <w:tcW w:type="dxa" w:w="3120"/>
-            <w:vAlign w:val="center"/>
-            <w:shd w:fill="FFFFFF"/>
+            <w:tcW w:type="dxa" w:w="3360"/>
           </w:tcPr>
           <w:p>
-            <w:pPr>
-              <w:spacing w:after="0" w:line="276" w:lineRule="auto"/>
-            </w:pPr>
             <w:r>
-              <w:rPr>
-                <w:rFonts w:ascii="Calibri" w:hAnsi="Calibri"/>
-                <w:b/>
-                <w:color w:val="1F4D78"/>
-                <w:sz w:val="19"/>
-              </w:rPr>
               <w:t>Espresso</w:t>
             </w:r>
           </w:p>
         </w:tc>
         <w:tc>
           <w:tcPr>
-            <w:tcW w:type="dxa" w:w="3120"/>
-            <w:vAlign w:val="center"/>
-            <w:shd w:fill="FFFFFF"/>
+            <w:tcW w:type="dxa" w:w="3360"/>
           </w:tcPr>
           <w:p>
-            <w:pPr>
-              <w:spacing w:after="0" w:line="276" w:lineRule="auto"/>
-            </w:pPr>
             <w:r>
-              <w:rPr>
-                <w:rFonts w:ascii="Calibri" w:hAnsi="Calibri"/>
-                <w:b/>
-                <w:color w:val="1F4D78"/>
-                <w:sz w:val="19"/>
-              </w:rPr>
               <w:t>Filter</w:t>
             </w:r>
           </w:p>
         </w:tc>
         <w:tc>
           <w:tcPr>
-            <w:tcW w:type="dxa" w:w="3120"/>
-            <w:vAlign w:val="center"/>
-            <w:shd w:fill="FFFFFF"/>
+            <w:tcW w:type="dxa" w:w="3360"/>
           </w:tcPr>
           <w:p>
-            <w:pPr>
-              <w:spacing w:after="0" w:line="276" w:lineRule="auto"/>
-            </w:pPr>
             <w:r>
-              <w:rPr>
-                <w:rFonts w:ascii="Calibri" w:hAnsi="Calibri"/>
-                <w:b/>
-                <w:color w:val="1F4D78"/>
-                <w:sz w:val="19"/>
-              </w:rPr>
               <w:t>Both</w:t>
             </w:r>
           </w:p>
         </w:tc>
       </w:tr>
     </w:tbl>
+    <w:p/>
     <w:p>
       <w:pPr>
-        <w:pStyle w:val="Heading3"/>
+        <w:pStyle w:val="Heading2"/>
+        <w:spacing w:before="160" w:after="80"/>
       </w:pPr>
       <w:r>
         <w:t>origin</w:t>
@@ -1819,55 +1182,42 @@
     <w:tbl>
       <w:tblPr>
         <w:tblStyle w:val="TableGrid"/>
-        <w:tblW w:type="dxa" w:w="9360"/>
-        <w:jc w:val="left"/>
-        <w:tblLayout w:type="fixed"/>
+        <w:tblW w:type="auto" w:w="0"/>
         <w:tblLook w:firstColumn="1" w:firstRow="1" w:lastColumn="0" w:lastRow="0" w:noHBand="0" w:noVBand="1" w:val="04A0"/>
       </w:tblPr>
       <w:tblGrid>
-        <w:gridCol w:w="4680"/>
-        <w:gridCol w:w="4680"/>
+        <w:gridCol w:w="3360"/>
+        <w:gridCol w:w="3360"/>
+        <w:gridCol w:w="3360"/>
       </w:tblGrid>
       <w:tr>
         <w:tc>
           <w:tcPr>
-            <w:tcW w:type="dxa" w:w="4680"/>
-            <w:vAlign w:val="center"/>
-            <w:shd w:fill="FFFFFF"/>
+            <w:tcW w:type="dxa" w:w="3360"/>
           </w:tcPr>
           <w:p>
-            <w:pPr>
-              <w:spacing w:after="0" w:line="276" w:lineRule="auto"/>
-            </w:pPr>
             <w:r>
-              <w:rPr>
-                <w:rFonts w:ascii="Calibri" w:hAnsi="Calibri"/>
-                <w:b/>
-                <w:color w:val="1F4D78"/>
-                <w:sz w:val="19"/>
-              </w:rPr>
               <w:t>Brazil</w:t>
             </w:r>
           </w:p>
         </w:tc>
         <w:tc>
           <w:tcPr>
-            <w:tcW w:type="dxa" w:w="4680"/>
-            <w:vAlign w:val="center"/>
-            <w:shd w:fill="FFFFFF"/>
+            <w:tcW w:type="dxa" w:w="3360"/>
           </w:tcPr>
           <w:p>
-            <w:pPr>
-              <w:spacing w:after="0" w:line="276" w:lineRule="auto"/>
-            </w:pPr>
             <w:r>
-              <w:rPr>
-                <w:rFonts w:ascii="Calibri" w:hAnsi="Calibri"/>
-                <w:b/>
-                <w:color w:val="1F4D78"/>
-                <w:sz w:val="19"/>
-              </w:rPr>
               <w:t>Colombia</w:t>
+            </w:r>
+          </w:p>
+        </w:tc>
+        <w:tc>
+          <w:tcPr>
+            <w:tcW w:type="dxa" w:w="3360"/>
+          </w:tcPr>
+          <w:p>
+            <w:r>
+              <w:t>Panama</w:t>
             </w:r>
           </w:p>
         </w:tc>
@@ -1875,74 +1225,30 @@
       <w:tr>
         <w:tc>
           <w:tcPr>
-            <w:tcW w:type="dxa" w:w="4680"/>
-            <w:vAlign w:val="center"/>
+            <w:tcW w:type="dxa" w:w="3360"/>
           </w:tcPr>
           <w:p>
-            <w:pPr>
-              <w:spacing w:after="0" w:line="276" w:lineRule="auto"/>
-            </w:pPr>
             <w:r>
-              <w:rPr>
-                <w:rFonts w:ascii="Calibri" w:hAnsi="Calibri"/>
-                <w:sz w:val="19"/>
-              </w:rPr>
-              <w:t>Panama</w:t>
+              <w:t>Indonesia</w:t>
             </w:r>
           </w:p>
         </w:tc>
         <w:tc>
           <w:tcPr>
-            <w:tcW w:type="dxa" w:w="4680"/>
-            <w:vAlign w:val="center"/>
+            <w:tcW w:type="dxa" w:w="3360"/>
           </w:tcPr>
           <w:p>
-            <w:pPr>
-              <w:spacing w:after="0" w:line="276" w:lineRule="auto"/>
-            </w:pPr>
             <w:r>
-              <w:rPr>
-                <w:rFonts w:ascii="Calibri" w:hAnsi="Calibri"/>
-                <w:sz w:val="19"/>
-              </w:rPr>
-              <w:t>Indonesia</w:t>
-            </w:r>
-          </w:p>
-        </w:tc>
-      </w:tr>
-      <w:tr>
-        <w:tc>
-          <w:tcPr>
-            <w:tcW w:type="dxa" w:w="4680"/>
-            <w:vAlign w:val="center"/>
-          </w:tcPr>
-          <w:p>
-            <w:pPr>
-              <w:spacing w:after="0" w:line="276" w:lineRule="auto"/>
-            </w:pPr>
-            <w:r>
-              <w:rPr>
-                <w:rFonts w:ascii="Calibri" w:hAnsi="Calibri"/>
-                <w:sz w:val="19"/>
-              </w:rPr>
               <w:t>Ethiopia</w:t>
             </w:r>
           </w:p>
         </w:tc>
         <w:tc>
           <w:tcPr>
-            <w:tcW w:type="dxa" w:w="4680"/>
-            <w:vAlign w:val="center"/>
+            <w:tcW w:type="dxa" w:w="3360"/>
           </w:tcPr>
           <w:p>
-            <w:pPr>
-              <w:spacing w:after="0" w:line="276" w:lineRule="auto"/>
-            </w:pPr>
             <w:r>
-              <w:rPr>
-                <w:rFonts w:ascii="Calibri" w:hAnsi="Calibri"/>
-                <w:sz w:val="19"/>
-              </w:rPr>
               <w:t>Bolivia</w:t>
             </w:r>
           </w:p>
@@ -1951,37 +1257,31 @@
       <w:tr>
         <w:tc>
           <w:tcPr>
-            <w:tcW w:type="dxa" w:w="4680"/>
-            <w:vAlign w:val="center"/>
+            <w:tcW w:type="dxa" w:w="3360"/>
           </w:tcPr>
           <w:p>
-            <w:pPr>
-              <w:spacing w:after="0" w:line="276" w:lineRule="auto"/>
-            </w:pPr>
             <w:r>
-              <w:rPr>
-                <w:rFonts w:ascii="Calibri" w:hAnsi="Calibri"/>
-                <w:sz w:val="19"/>
-              </w:rPr>
               <w:t>Costa Rica</w:t>
             </w:r>
           </w:p>
         </w:tc>
         <w:tc>
           <w:tcPr>
-            <w:tcW w:type="dxa" w:w="4680"/>
-            <w:vAlign w:val="center"/>
+            <w:tcW w:type="dxa" w:w="3360"/>
           </w:tcPr>
           <w:p>
-            <w:pPr>
-              <w:spacing w:after="0" w:line="276" w:lineRule="auto"/>
-            </w:pPr>
             <w:r>
-              <w:rPr>
-                <w:rFonts w:ascii="Calibri" w:hAnsi="Calibri"/>
-                <w:sz w:val="19"/>
-              </w:rPr>
               <w:t>El Salvador</w:t>
+            </w:r>
+          </w:p>
+        </w:tc>
+        <w:tc>
+          <w:tcPr>
+            <w:tcW w:type="dxa" w:w="3360"/>
+          </w:tcPr>
+          <w:p>
+            <w:r>
+              <w:t>Yunnan</w:t>
             </w:r>
           </w:p>
         </w:tc>
@@ -1989,74 +1289,30 @@
       <w:tr>
         <w:tc>
           <w:tcPr>
-            <w:tcW w:type="dxa" w:w="4680"/>
-            <w:vAlign w:val="center"/>
+            <w:tcW w:type="dxa" w:w="3360"/>
           </w:tcPr>
           <w:p>
-            <w:pPr>
-              <w:spacing w:after="0" w:line="276" w:lineRule="auto"/>
-            </w:pPr>
             <w:r>
-              <w:rPr>
-                <w:rFonts w:ascii="Calibri" w:hAnsi="Calibri"/>
-                <w:sz w:val="19"/>
-              </w:rPr>
-              <w:t>Yunnan</w:t>
+              <w:t>Guatemala</w:t>
             </w:r>
           </w:p>
         </w:tc>
         <w:tc>
           <w:tcPr>
-            <w:tcW w:type="dxa" w:w="4680"/>
-            <w:vAlign w:val="center"/>
+            <w:tcW w:type="dxa" w:w="3360"/>
           </w:tcPr>
           <w:p>
-            <w:pPr>
-              <w:spacing w:after="0" w:line="276" w:lineRule="auto"/>
-            </w:pPr>
             <w:r>
-              <w:rPr>
-                <w:rFonts w:ascii="Calibri" w:hAnsi="Calibri"/>
-                <w:sz w:val="19"/>
-              </w:rPr>
-              <w:t>Guatemala</w:t>
-            </w:r>
-          </w:p>
-        </w:tc>
-      </w:tr>
-      <w:tr>
-        <w:tc>
-          <w:tcPr>
-            <w:tcW w:type="dxa" w:w="4680"/>
-            <w:vAlign w:val="center"/>
-          </w:tcPr>
-          <w:p>
-            <w:pPr>
-              <w:spacing w:after="0" w:line="276" w:lineRule="auto"/>
-            </w:pPr>
-            <w:r>
-              <w:rPr>
-                <w:rFonts w:ascii="Calibri" w:hAnsi="Calibri"/>
-                <w:sz w:val="19"/>
-              </w:rPr>
               <w:t>Honduras</w:t>
             </w:r>
           </w:p>
         </w:tc>
         <w:tc>
           <w:tcPr>
-            <w:tcW w:type="dxa" w:w="4680"/>
-            <w:vAlign w:val="center"/>
+            <w:tcW w:type="dxa" w:w="3360"/>
           </w:tcPr>
           <w:p>
-            <w:pPr>
-              <w:spacing w:after="0" w:line="276" w:lineRule="auto"/>
-            </w:pPr>
             <w:r>
-              <w:rPr>
-                <w:rFonts w:ascii="Calibri" w:hAnsi="Calibri"/>
-                <w:sz w:val="19"/>
-              </w:rPr>
               <w:t>Kenya</w:t>
             </w:r>
           </w:p>
@@ -2065,37 +1321,31 @@
       <w:tr>
         <w:tc>
           <w:tcPr>
-            <w:tcW w:type="dxa" w:w="4680"/>
-            <w:vAlign w:val="center"/>
+            <w:tcW w:type="dxa" w:w="3360"/>
           </w:tcPr>
           <w:p>
-            <w:pPr>
-              <w:spacing w:after="0" w:line="276" w:lineRule="auto"/>
-            </w:pPr>
             <w:r>
-              <w:rPr>
-                <w:rFonts w:ascii="Calibri" w:hAnsi="Calibri"/>
-                <w:sz w:val="19"/>
-              </w:rPr>
               <w:t>Malaysia</w:t>
             </w:r>
           </w:p>
         </w:tc>
         <w:tc>
           <w:tcPr>
-            <w:tcW w:type="dxa" w:w="4680"/>
-            <w:vAlign w:val="center"/>
+            <w:tcW w:type="dxa" w:w="3360"/>
           </w:tcPr>
           <w:p>
-            <w:pPr>
-              <w:spacing w:after="0" w:line="276" w:lineRule="auto"/>
-            </w:pPr>
             <w:r>
-              <w:rPr>
-                <w:rFonts w:ascii="Calibri" w:hAnsi="Calibri"/>
-                <w:sz w:val="19"/>
-              </w:rPr>
               <w:t>Nicaragua</w:t>
+            </w:r>
+          </w:p>
+        </w:tc>
+        <w:tc>
+          <w:tcPr>
+            <w:tcW w:type="dxa" w:w="3360"/>
+          </w:tcPr>
+          <w:p>
+            <w:r>
+              <w:t>Rwanda</w:t>
             </w:r>
           </w:p>
         </w:tc>
@@ -2103,74 +1353,30 @@
       <w:tr>
         <w:tc>
           <w:tcPr>
-            <w:tcW w:type="dxa" w:w="4680"/>
-            <w:vAlign w:val="center"/>
+            <w:tcW w:type="dxa" w:w="3360"/>
           </w:tcPr>
           <w:p>
-            <w:pPr>
-              <w:spacing w:after="0" w:line="276" w:lineRule="auto"/>
-            </w:pPr>
             <w:r>
-              <w:rPr>
-                <w:rFonts w:ascii="Calibri" w:hAnsi="Calibri"/>
-                <w:sz w:val="19"/>
-              </w:rPr>
-              <w:t>Rwanda</w:t>
+              <w:t>El Obraje</w:t>
             </w:r>
           </w:p>
         </w:tc>
         <w:tc>
           <w:tcPr>
-            <w:tcW w:type="dxa" w:w="4680"/>
-            <w:vAlign w:val="center"/>
+            <w:tcW w:type="dxa" w:w="3360"/>
           </w:tcPr>
           <w:p>
-            <w:pPr>
-              <w:spacing w:after="0" w:line="276" w:lineRule="auto"/>
-            </w:pPr>
             <w:r>
-              <w:rPr>
-                <w:rFonts w:ascii="Calibri" w:hAnsi="Calibri"/>
-                <w:sz w:val="19"/>
-              </w:rPr>
-              <w:t>El Obraje</w:t>
-            </w:r>
-          </w:p>
-        </w:tc>
-      </w:tr>
-      <w:tr>
-        <w:tc>
-          <w:tcPr>
-            <w:tcW w:type="dxa" w:w="4680"/>
-            <w:vAlign w:val="center"/>
-          </w:tcPr>
-          <w:p>
-            <w:pPr>
-              <w:spacing w:after="0" w:line="276" w:lineRule="auto"/>
-            </w:pPr>
-            <w:r>
-              <w:rPr>
-                <w:rFonts w:ascii="Calibri" w:hAnsi="Calibri"/>
-                <w:sz w:val="19"/>
-              </w:rPr>
               <w:t>Tanzania</w:t>
             </w:r>
           </w:p>
         </w:tc>
         <w:tc>
           <w:tcPr>
-            <w:tcW w:type="dxa" w:w="4680"/>
-            <w:vAlign w:val="center"/>
+            <w:tcW w:type="dxa" w:w="3360"/>
           </w:tcPr>
           <w:p>
-            <w:pPr>
-              <w:spacing w:after="0" w:line="276" w:lineRule="auto"/>
-            </w:pPr>
             <w:r>
-              <w:rPr>
-                <w:rFonts w:ascii="Calibri" w:hAnsi="Calibri"/>
-                <w:sz w:val="19"/>
-              </w:rPr>
               <w:t>Uganda</w:t>
             </w:r>
           </w:p>
@@ -2179,37 +1385,31 @@
       <w:tr>
         <w:tc>
           <w:tcPr>
-            <w:tcW w:type="dxa" w:w="4680"/>
-            <w:vAlign w:val="center"/>
+            <w:tcW w:type="dxa" w:w="3360"/>
           </w:tcPr>
           <w:p>
-            <w:pPr>
-              <w:spacing w:after="0" w:line="276" w:lineRule="auto"/>
-            </w:pPr>
             <w:r>
-              <w:rPr>
-                <w:rFonts w:ascii="Calibri" w:hAnsi="Calibri"/>
-                <w:sz w:val="19"/>
-              </w:rPr>
               <w:t>Ecuador</w:t>
             </w:r>
           </w:p>
         </w:tc>
         <w:tc>
           <w:tcPr>
-            <w:tcW w:type="dxa" w:w="4680"/>
-            <w:vAlign w:val="center"/>
+            <w:tcW w:type="dxa" w:w="3360"/>
           </w:tcPr>
           <w:p>
-            <w:pPr>
-              <w:spacing w:after="0" w:line="276" w:lineRule="auto"/>
-            </w:pPr>
             <w:r>
-              <w:rPr>
-                <w:rFonts w:ascii="Calibri" w:hAnsi="Calibri"/>
-                <w:sz w:val="19"/>
-              </w:rPr>
               <w:t>Thailand</w:t>
+            </w:r>
+          </w:p>
+        </w:tc>
+        <w:tc>
+          <w:tcPr>
+            <w:tcW w:type="dxa" w:w="3360"/>
+          </w:tcPr>
+          <w:p>
+            <w:r>
+              <w:t>Peru</w:t>
             </w:r>
           </w:p>
         </w:tc>
@@ -2217,74 +1417,30 @@
       <w:tr>
         <w:tc>
           <w:tcPr>
-            <w:tcW w:type="dxa" w:w="4680"/>
-            <w:vAlign w:val="center"/>
+            <w:tcW w:type="dxa" w:w="3360"/>
           </w:tcPr>
           <w:p>
-            <w:pPr>
-              <w:spacing w:after="0" w:line="276" w:lineRule="auto"/>
-            </w:pPr>
             <w:r>
-              <w:rPr>
-                <w:rFonts w:ascii="Calibri" w:hAnsi="Calibri"/>
-                <w:sz w:val="19"/>
-              </w:rPr>
-              <w:t>Peru</w:t>
+              <w:t>Papua New Guinea</w:t>
             </w:r>
           </w:p>
         </w:tc>
         <w:tc>
           <w:tcPr>
-            <w:tcW w:type="dxa" w:w="4680"/>
-            <w:vAlign w:val="center"/>
+            <w:tcW w:type="dxa" w:w="3360"/>
           </w:tcPr>
           <w:p>
-            <w:pPr>
-              <w:spacing w:after="0" w:line="276" w:lineRule="auto"/>
-            </w:pPr>
             <w:r>
-              <w:rPr>
-                <w:rFonts w:ascii="Calibri" w:hAnsi="Calibri"/>
-                <w:sz w:val="19"/>
-              </w:rPr>
-              <w:t>Papua New Guinea</w:t>
-            </w:r>
-          </w:p>
-        </w:tc>
-      </w:tr>
-      <w:tr>
-        <w:tc>
-          <w:tcPr>
-            <w:tcW w:type="dxa" w:w="4680"/>
-            <w:vAlign w:val="center"/>
-          </w:tcPr>
-          <w:p>
-            <w:pPr>
-              <w:spacing w:after="0" w:line="276" w:lineRule="auto"/>
-            </w:pPr>
-            <w:r>
-              <w:rPr>
-                <w:rFonts w:ascii="Calibri" w:hAnsi="Calibri"/>
-                <w:sz w:val="19"/>
-              </w:rPr>
               <w:t>Vietnam</w:t>
             </w:r>
           </w:p>
         </w:tc>
         <w:tc>
           <w:tcPr>
-            <w:tcW w:type="dxa" w:w="4680"/>
-            <w:vAlign w:val="center"/>
+            <w:tcW w:type="dxa" w:w="3360"/>
           </w:tcPr>
           <w:p>
-            <w:pPr>
-              <w:spacing w:after="0" w:line="276" w:lineRule="auto"/>
-            </w:pPr>
             <w:r>
-              <w:rPr>
-                <w:rFonts w:ascii="Calibri" w:hAnsi="Calibri"/>
-                <w:sz w:val="19"/>
-              </w:rPr>
               <w:t>India</w:t>
             </w:r>
           </w:p>
@@ -2293,76 +1449,41 @@
       <w:tr>
         <w:tc>
           <w:tcPr>
-            <w:tcW w:type="dxa" w:w="4680"/>
-            <w:vAlign w:val="center"/>
+            <w:tcW w:type="dxa" w:w="3360"/>
           </w:tcPr>
           <w:p>
-            <w:pPr>
-              <w:spacing w:after="0" w:line="276" w:lineRule="auto"/>
-            </w:pPr>
             <w:r>
-              <w:rPr>
-                <w:rFonts w:ascii="Calibri" w:hAnsi="Calibri"/>
-                <w:sz w:val="19"/>
-              </w:rPr>
               <w:t>Jamaica</w:t>
             </w:r>
           </w:p>
         </w:tc>
         <w:tc>
           <w:tcPr>
-            <w:tcW w:type="dxa" w:w="4680"/>
-            <w:vAlign w:val="center"/>
+            <w:tcW w:type="dxa" w:w="3360"/>
           </w:tcPr>
           <w:p>
-            <w:pPr>
-              <w:spacing w:after="0" w:line="276" w:lineRule="auto"/>
-            </w:pPr>
             <w:r>
-              <w:rPr>
-                <w:rFonts w:ascii="Calibri" w:hAnsi="Calibri"/>
-                <w:sz w:val="19"/>
-              </w:rPr>
               <w:t>Yemen</w:t>
-            </w:r>
-          </w:p>
-        </w:tc>
-      </w:tr>
-      <w:tr>
-        <w:tc>
-          <w:tcPr>
-            <w:tcW w:type="dxa" w:w="4680"/>
-            <w:vAlign w:val="center"/>
-          </w:tcPr>
-          <w:p>
-            <w:pPr>
-              <w:spacing w:after="0" w:line="276" w:lineRule="auto"/>
-            </w:pPr>
-            <w:r>
-              <w:rPr>
-                <w:rFonts w:ascii="Calibri" w:hAnsi="Calibri"/>
-                <w:sz w:val="19"/>
-              </w:rPr>
-              <w:t>Myanmar</w:t>
             </w:r>
           </w:p>
         </w:tc>
         <w:tc>
           <w:tcPr>
-            <w:tcW w:type="dxa" w:w="4680"/>
-            <w:vAlign w:val="center"/>
+            <w:tcW w:type="dxa" w:w="3360"/>
           </w:tcPr>
           <w:p>
-            <w:pPr>
-              <w:spacing w:after="0" w:line="276" w:lineRule="auto"/>
-            </w:pPr>
+            <w:r>
+              <w:t>Myanmar</w:t>
+            </w:r>
           </w:p>
         </w:tc>
       </w:tr>
     </w:tbl>
+    <w:p/>
     <w:p>
       <w:pPr>
-        <w:pStyle w:val="Heading3"/>
+        <w:pStyle w:val="Heading2"/>
+        <w:spacing w:before="160" w:after="80"/>
       </w:pPr>
       <w:r>
         <w:t>blend</w:t>
@@ -2371,120 +1492,89 @@
     <w:tbl>
       <w:tblPr>
         <w:tblStyle w:val="TableGrid"/>
-        <w:tblW w:type="dxa" w:w="9360"/>
-        <w:jc w:val="left"/>
-        <w:tblLayout w:type="fixed"/>
+        <w:tblW w:type="auto" w:w="0"/>
         <w:tblLook w:firstColumn="1" w:firstRow="1" w:lastColumn="0" w:lastRow="0" w:noHBand="0" w:noVBand="1" w:val="04A0"/>
       </w:tblPr>
       <w:tblGrid>
-        <w:gridCol w:w="4680"/>
-        <w:gridCol w:w="4680"/>
+        <w:gridCol w:w="3360"/>
+        <w:gridCol w:w="3360"/>
+        <w:gridCol w:w="3360"/>
       </w:tblGrid>
       <w:tr>
         <w:tc>
           <w:tcPr>
-            <w:tcW w:type="dxa" w:w="4680"/>
-            <w:vAlign w:val="center"/>
-            <w:shd w:fill="FFFFFF"/>
+            <w:tcW w:type="dxa" w:w="3360"/>
           </w:tcPr>
           <w:p>
-            <w:pPr>
-              <w:spacing w:after="0" w:line="276" w:lineRule="auto"/>
-            </w:pPr>
             <w:r>
-              <w:rPr>
-                <w:rFonts w:ascii="Calibri" w:hAnsi="Calibri"/>
-                <w:b/>
-                <w:color w:val="1F4D78"/>
-                <w:sz w:val="19"/>
-              </w:rPr>
               <w:t>Yes</w:t>
             </w:r>
           </w:p>
         </w:tc>
         <w:tc>
           <w:tcPr>
-            <w:tcW w:type="dxa" w:w="4680"/>
-            <w:vAlign w:val="center"/>
-            <w:shd w:fill="FFFFFF"/>
+            <w:tcW w:type="dxa" w:w="3360"/>
           </w:tcPr>
           <w:p>
-            <w:pPr>
-              <w:spacing w:after="0" w:line="276" w:lineRule="auto"/>
-            </w:pPr>
             <w:r>
-              <w:rPr>
-                <w:rFonts w:ascii="Calibri" w:hAnsi="Calibri"/>
-                <w:b/>
-                <w:color w:val="1F4D78"/>
-                <w:sz w:val="19"/>
-              </w:rPr>
               <w:t>No</w:t>
             </w:r>
           </w:p>
         </w:tc>
+        <w:tc>
+          <w:tcPr>
+            <w:tcW w:type="dxa" w:w="3360"/>
+          </w:tcPr>
+          <w:p>
+            <w:r/>
+          </w:p>
+        </w:tc>
       </w:tr>
     </w:tbl>
+    <w:p/>
     <w:p>
       <w:pPr>
         <w:pStyle w:val="Heading1"/>
+        <w:spacing w:before="160" w:after="80"/>
       </w:pPr>
       <w:r>
-        <w:t>7. Taste Category Mapping Guide</w:t>
+        <w:t>7. Taste Category Guide</w:t>
       </w:r>
     </w:p>
     <w:tbl>
       <w:tblPr>
         <w:tblStyle w:val="TableGrid"/>
-        <w:tblW w:type="dxa" w:w="9360"/>
-        <w:jc w:val="left"/>
-        <w:tblLayout w:type="fixed"/>
+        <w:tblW w:type="auto" w:w="0"/>
         <w:tblLook w:firstColumn="1" w:firstRow="1" w:lastColumn="0" w:lastRow="0" w:noHBand="0" w:noVBand="1" w:val="04A0"/>
       </w:tblPr>
       <w:tblGrid>
-        <w:gridCol w:w="4680"/>
-        <w:gridCol w:w="4680"/>
+        <w:gridCol w:w="5040"/>
+        <w:gridCol w:w="5040"/>
       </w:tblGrid>
       <w:tr>
         <w:tc>
           <w:tcPr>
-            <w:tcW w:type="dxa" w:w="2500"/>
-            <w:vAlign w:val="center"/>
-            <w:shd w:fill="E8EEF5"/>
+            <w:tcW w:type="dxa" w:w="5040"/>
           </w:tcPr>
           <w:p>
-            <w:pPr>
-              <w:spacing w:after="0" w:line="276" w:lineRule="auto"/>
-            </w:pPr>
             <w:r>
               <w:rPr>
-                <w:rFonts w:ascii="Calibri" w:hAnsi="Calibri"/>
                 <w:b/>
-                <w:color w:val="1F4D78"/>
-                <w:sz w:val="19"/>
               </w:rPr>
-              <w:t>Item</w:t>
+              <w:t>Category</w:t>
             </w:r>
           </w:p>
         </w:tc>
         <w:tc>
           <w:tcPr>
-            <w:tcW w:type="dxa" w:w="6860"/>
-            <w:vAlign w:val="center"/>
-            <w:shd w:fill="E8EEF5"/>
+            <w:tcW w:type="dxa" w:w="5040"/>
           </w:tcPr>
           <w:p>
-            <w:pPr>
-              <w:spacing w:after="0" w:line="276" w:lineRule="auto"/>
-            </w:pPr>
             <w:r>
               <w:rPr>
-                <w:rFonts w:ascii="Calibri" w:hAnsi="Calibri"/>
                 <w:b/>
-                <w:color w:val="1F4D78"/>
-                <w:sz w:val="19"/>
               </w:rPr>
-              <w:t>Instruction</w:t>
+              <w:t>Use For</w:t>
             </w:r>
           </w:p>
         </w:tc>
@@ -2492,37 +1582,21 @@
       <w:tr>
         <w:tc>
           <w:tcPr>
-            <w:tcW w:type="dxa" w:w="2500"/>
-            <w:vAlign w:val="center"/>
+            <w:tcW w:type="dxa" w:w="5040"/>
           </w:tcPr>
           <w:p>
-            <w:pPr>
-              <w:spacing w:after="0" w:line="276" w:lineRule="auto"/>
-            </w:pPr>
             <w:r>
-              <w:rPr>
-                <w:rFonts w:ascii="Calibri" w:hAnsi="Calibri"/>
-                <w:sz w:val="19"/>
-              </w:rPr>
               <w:t>Fruity</w:t>
             </w:r>
           </w:p>
         </w:tc>
         <w:tc>
           <w:tcPr>
-            <w:tcW w:type="dxa" w:w="6860"/>
-            <w:vAlign w:val="center"/>
+            <w:tcW w:type="dxa" w:w="5040"/>
           </w:tcPr>
           <w:p>
-            <w:pPr>
-              <w:spacing w:after="0" w:line="276" w:lineRule="auto"/>
-            </w:pPr>
             <w:r>
-              <w:rPr>
-                <w:rFonts w:ascii="Calibri" w:hAnsi="Calibri"/>
-                <w:sz w:val="19"/>
-              </w:rPr>
-              <w:t>Fruit names such as berry, grape, apple, citrus, peach, mango, lychee, melon, plum, raisin, dates, pomelo, cherry.</w:t>
+              <w:t>Fruit notes such as berry, grape, apple, citrus, peach, mango, lychee, melon, plum, raisin, dates, pomelo, cherry.</w:t>
             </w:r>
           </w:p>
         </w:tc>
@@ -2530,36 +1604,20 @@
       <w:tr>
         <w:tc>
           <w:tcPr>
-            <w:tcW w:type="dxa" w:w="2500"/>
-            <w:vAlign w:val="center"/>
+            <w:tcW w:type="dxa" w:w="5040"/>
           </w:tcPr>
           <w:p>
-            <w:pPr>
-              <w:spacing w:after="0" w:line="276" w:lineRule="auto"/>
-            </w:pPr>
             <w:r>
-              <w:rPr>
-                <w:rFonts w:ascii="Calibri" w:hAnsi="Calibri"/>
-                <w:sz w:val="19"/>
-              </w:rPr>
               <w:t>Floral</w:t>
             </w:r>
           </w:p>
         </w:tc>
         <w:tc>
           <w:tcPr>
-            <w:tcW w:type="dxa" w:w="6860"/>
-            <w:vAlign w:val="center"/>
+            <w:tcW w:type="dxa" w:w="5040"/>
           </w:tcPr>
           <w:p>
-            <w:pPr>
-              <w:spacing w:after="0" w:line="276" w:lineRule="auto"/>
-            </w:pPr>
             <w:r>
-              <w:rPr>
-                <w:rFonts w:ascii="Calibri" w:hAnsi="Calibri"/>
-                <w:sz w:val="19"/>
-              </w:rPr>
               <w:t>Floral notes such as jasmine, rose, osmanthus, honeysuckle, frangipani, sakura, coffee blossom.</w:t>
             </w:r>
           </w:p>
@@ -2568,37 +1626,21 @@
       <w:tr>
         <w:tc>
           <w:tcPr>
-            <w:tcW w:type="dxa" w:w="2500"/>
-            <w:vAlign w:val="center"/>
+            <w:tcW w:type="dxa" w:w="5040"/>
           </w:tcPr>
           <w:p>
-            <w:pPr>
-              <w:spacing w:after="0" w:line="276" w:lineRule="auto"/>
-            </w:pPr>
             <w:r>
-              <w:rPr>
-                <w:rFonts w:ascii="Calibri" w:hAnsi="Calibri"/>
-                <w:sz w:val="19"/>
-              </w:rPr>
               <w:t>Sweet</w:t>
             </w:r>
           </w:p>
         </w:tc>
         <w:tc>
           <w:tcPr>
-            <w:tcW w:type="dxa" w:w="6860"/>
-            <w:vAlign w:val="center"/>
+            <w:tcW w:type="dxa" w:w="5040"/>
           </w:tcPr>
           <w:p>
-            <w:pPr>
-              <w:spacing w:after="0" w:line="276" w:lineRule="auto"/>
-            </w:pPr>
             <w:r>
-              <w:rPr>
-                <w:rFonts w:ascii="Calibri" w:hAnsi="Calibri"/>
-                <w:sz w:val="19"/>
-              </w:rPr>
-              <w:t>Dessert or sweet notes such as caramel, honey, vanilla, chocolate, syrup, biscoff, cereal milk, molasses, brown sugar.</w:t>
+              <w:t>Dessert or sweet notes such as caramel, honey, vanilla, syrup, biscoff, cereal milk, molasses, brown sugar.</w:t>
             </w:r>
           </w:p>
         </w:tc>
@@ -2606,36 +1648,20 @@
       <w:tr>
         <w:tc>
           <w:tcPr>
-            <w:tcW w:type="dxa" w:w="2500"/>
-            <w:vAlign w:val="center"/>
+            <w:tcW w:type="dxa" w:w="5040"/>
           </w:tcPr>
           <w:p>
-            <w:pPr>
-              <w:spacing w:after="0" w:line="276" w:lineRule="auto"/>
-            </w:pPr>
             <w:r>
-              <w:rPr>
-                <w:rFonts w:ascii="Calibri" w:hAnsi="Calibri"/>
-                <w:sz w:val="19"/>
-              </w:rPr>
               <w:t>Nutty/Cocoa</w:t>
             </w:r>
           </w:p>
         </w:tc>
         <w:tc>
           <w:tcPr>
-            <w:tcW w:type="dxa" w:w="6860"/>
-            <w:vAlign w:val="center"/>
+            <w:tcW w:type="dxa" w:w="5040"/>
           </w:tcPr>
           <w:p>
-            <w:pPr>
-              <w:spacing w:after="0" w:line="276" w:lineRule="auto"/>
-            </w:pPr>
             <w:r>
-              <w:rPr>
-                <w:rFonts w:ascii="Calibri" w:hAnsi="Calibri"/>
-                <w:sz w:val="19"/>
-              </w:rPr>
               <w:t>Nut, cocoa, chocolate, hazelnut, almond, macadamia, peanut, cacao.</w:t>
             </w:r>
           </w:p>
@@ -2644,36 +1670,20 @@
       <w:tr>
         <w:tc>
           <w:tcPr>
-            <w:tcW w:type="dxa" w:w="2500"/>
-            <w:vAlign w:val="center"/>
+            <w:tcW w:type="dxa" w:w="5040"/>
           </w:tcPr>
           <w:p>
-            <w:pPr>
-              <w:spacing w:after="0" w:line="276" w:lineRule="auto"/>
-            </w:pPr>
             <w:r>
-              <w:rPr>
-                <w:rFonts w:ascii="Calibri" w:hAnsi="Calibri"/>
-                <w:sz w:val="19"/>
-              </w:rPr>
               <w:t>Spices</w:t>
             </w:r>
           </w:p>
         </w:tc>
         <w:tc>
           <w:tcPr>
-            <w:tcW w:type="dxa" w:w="6860"/>
-            <w:vAlign w:val="center"/>
+            <w:tcW w:type="dxa" w:w="5040"/>
           </w:tcPr>
           <w:p>
-            <w:pPr>
-              <w:spacing w:after="0" w:line="276" w:lineRule="auto"/>
-            </w:pPr>
             <w:r>
-              <w:rPr>
-                <w:rFonts w:ascii="Calibri" w:hAnsi="Calibri"/>
-                <w:sz w:val="19"/>
-              </w:rPr>
               <w:t>Cinnamon, clove, nutmeg, cardamom, pepper, ginger, spice-like notes.</w:t>
             </w:r>
           </w:p>
@@ -2682,36 +1692,20 @@
       <w:tr>
         <w:tc>
           <w:tcPr>
-            <w:tcW w:type="dxa" w:w="2500"/>
-            <w:vAlign w:val="center"/>
+            <w:tcW w:type="dxa" w:w="5040"/>
           </w:tcPr>
           <w:p>
-            <w:pPr>
-              <w:spacing w:after="0" w:line="276" w:lineRule="auto"/>
-            </w:pPr>
             <w:r>
-              <w:rPr>
-                <w:rFonts w:ascii="Calibri" w:hAnsi="Calibri"/>
-                <w:sz w:val="19"/>
-              </w:rPr>
               <w:t>Roasted</w:t>
             </w:r>
           </w:p>
         </w:tc>
         <w:tc>
           <w:tcPr>
-            <w:tcW w:type="dxa" w:w="6860"/>
-            <w:vAlign w:val="center"/>
+            <w:tcW w:type="dxa" w:w="5040"/>
           </w:tcPr>
           <w:p>
-            <w:pPr>
-              <w:spacing w:after="0" w:line="276" w:lineRule="auto"/>
-            </w:pPr>
             <w:r>
-              <w:rPr>
-                <w:rFonts w:ascii="Calibri" w:hAnsi="Calibri"/>
-                <w:sz w:val="19"/>
-              </w:rPr>
               <w:t>Smoke, toast, roasted nuts, burnt sugar, roast-forward notes.</w:t>
             </w:r>
           </w:p>
@@ -2720,36 +1714,20 @@
       <w:tr>
         <w:tc>
           <w:tcPr>
-            <w:tcW w:type="dxa" w:w="2500"/>
-            <w:vAlign w:val="center"/>
+            <w:tcW w:type="dxa" w:w="5040"/>
           </w:tcPr>
           <w:p>
-            <w:pPr>
-              <w:spacing w:after="0" w:line="276" w:lineRule="auto"/>
-            </w:pPr>
             <w:r>
-              <w:rPr>
-                <w:rFonts w:ascii="Calibri" w:hAnsi="Calibri"/>
-                <w:sz w:val="19"/>
-              </w:rPr>
               <w:t>Sour/Fermented</w:t>
             </w:r>
           </w:p>
         </w:tc>
         <w:tc>
           <w:tcPr>
-            <w:tcW w:type="dxa" w:w="6860"/>
-            <w:vAlign w:val="center"/>
+            <w:tcW w:type="dxa" w:w="5040"/>
           </w:tcPr>
           <w:p>
-            <w:pPr>
-              <w:spacing w:after="0" w:line="276" w:lineRule="auto"/>
-            </w:pPr>
             <w:r>
-              <w:rPr>
-                <w:rFonts w:ascii="Calibri" w:hAnsi="Calibri"/>
-                <w:sz w:val="19"/>
-              </w:rPr>
               <w:t>Winey, boozy, kombucha, vinegar, lactic, fermented, yogurt-like notes.</w:t>
             </w:r>
           </w:p>
@@ -2758,36 +1736,20 @@
       <w:tr>
         <w:tc>
           <w:tcPr>
-            <w:tcW w:type="dxa" w:w="2500"/>
-            <w:vAlign w:val="center"/>
+            <w:tcW w:type="dxa" w:w="5040"/>
           </w:tcPr>
           <w:p>
-            <w:pPr>
-              <w:spacing w:after="0" w:line="276" w:lineRule="auto"/>
-            </w:pPr>
             <w:r>
-              <w:rPr>
-                <w:rFonts w:ascii="Calibri" w:hAnsi="Calibri"/>
-                <w:sz w:val="19"/>
-              </w:rPr>
               <w:t>Green/Vegetative</w:t>
             </w:r>
           </w:p>
         </w:tc>
         <w:tc>
           <w:tcPr>
-            <w:tcW w:type="dxa" w:w="6860"/>
-            <w:vAlign w:val="center"/>
+            <w:tcW w:type="dxa" w:w="5040"/>
           </w:tcPr>
           <w:p>
-            <w:pPr>
-              <w:spacing w:after="0" w:line="276" w:lineRule="auto"/>
-            </w:pPr>
             <w:r>
-              <w:rPr>
-                <w:rFonts w:ascii="Calibri" w:hAnsi="Calibri"/>
-                <w:sz w:val="19"/>
-              </w:rPr>
               <w:t>Herbal, grassy, tea leaf, tomato, green pepper, leafy, vegetal notes.</w:t>
             </w:r>
           </w:p>
@@ -2796,45 +1758,31 @@
       <w:tr>
         <w:tc>
           <w:tcPr>
-            <w:tcW w:type="dxa" w:w="2500"/>
-            <w:vAlign w:val="center"/>
+            <w:tcW w:type="dxa" w:w="5040"/>
           </w:tcPr>
           <w:p>
-            <w:pPr>
-              <w:spacing w:after="0" w:line="276" w:lineRule="auto"/>
-            </w:pPr>
             <w:r>
-              <w:rPr>
-                <w:rFonts w:ascii="Calibri" w:hAnsi="Calibri"/>
-                <w:sz w:val="19"/>
-              </w:rPr>
               <w:t>Other</w:t>
             </w:r>
           </w:p>
         </w:tc>
         <w:tc>
           <w:tcPr>
-            <w:tcW w:type="dxa" w:w="6860"/>
-            <w:vAlign w:val="center"/>
+            <w:tcW w:type="dxa" w:w="5040"/>
           </w:tcPr>
           <w:p>
-            <w:pPr>
-              <w:spacing w:after="0" w:line="276" w:lineRule="auto"/>
-            </w:pPr>
             <w:r>
-              <w:rPr>
-                <w:rFonts w:ascii="Calibri" w:hAnsi="Calibri"/>
-                <w:sz w:val="19"/>
-              </w:rPr>
               <w:t>Use only when notes do not fit the categories above.</w:t>
             </w:r>
           </w:p>
         </w:tc>
       </w:tr>
     </w:tbl>
+    <w:p/>
     <w:p>
       <w:pPr>
         <w:pStyle w:val="Heading1"/>
+        <w:spacing w:before="160" w:after="80"/>
       </w:pPr>
       <w:r>
         <w:t>8. Verification Checklist</w:t>
@@ -2843,6 +1791,7 @@
     <w:p>
       <w:pPr>
         <w:pStyle w:val="ListBullet"/>
+        <w:spacing w:after="20"/>
       </w:pPr>
       <w:r>
         <w:t>Row count equals the number of included coffee bean product listings.</w:t>
@@ -2851,139 +1800,141 @@
     <w:p>
       <w:pPr>
         <w:pStyle w:val="ListBullet"/>
+        <w:spacing w:after="20"/>
       </w:pPr>
       <w:r>
-        <w:t>No packaging, equipment, bundles, drip bags, gift sets, aroma kits, or non-coffee products are present unless explicitly requested.</w:t>
+        <w:t>No skipped product types are present unless explicitly requested.</w:t>
       </w:r>
     </w:p>
     <w:p>
       <w:pPr>
         <w:pStyle w:val="ListBullet"/>
+        <w:spacing w:after="20"/>
       </w:pPr>
       <w:r>
-        <w:t>All price_200g values can be traced to a listed variant and the prorating formula.</w:t>
+        <w:t>Every price_200g is numeric only and traceable to a listed variant and the prorating formula.</w:t>
       </w:r>
     </w:p>
     <w:p>
       <w:pPr>
         <w:pStyle w:val="ListBullet"/>
+        <w:spacing w:after="20"/>
       </w:pPr>
       <w:r>
-        <w:t>All fixed-validation columns use exact allowed values only.</w:t>
+        <w:t>taste_notes contains only short direct notes from the listing, not the full description.</w:t>
       </w:r>
     </w:p>
     <w:p>
       <w:pPr>
         <w:pStyle w:val="ListBullet"/>
+        <w:spacing w:after="20"/>
       </w:pPr>
       <w:r>
-        <w:t>Every row has a brand, name, price_200g, image_url when available, and product link.</w:t>
+        <w:t>Roast level is Unknown whenever the listing does not explicitly state it.</w:t>
       </w:r>
     </w:p>
     <w:p>
       <w:pPr>
         <w:pStyle w:val="ListBullet"/>
+        <w:spacing w:after="20"/>
       </w:pPr>
       <w:r>
-        <w:t>Multi-origin and multi-category values are separated consistently using commas.</w:t>
+        <w:t>Fixed-value columns use allowed values; origin may contain comma-separated allowed values only for confirmed blends.</w:t>
       </w:r>
     </w:p>
     <w:p>
       <w:pPr>
         <w:pStyle w:val="ListBullet"/>
+        <w:spacing w:after="20"/>
       </w:pPr>
       <w:r>
-        <w:t>If the workbook was edited, test that the .xlsx opens and the archive has no errors.</w:t>
+        <w:t>Every row has brand, name, price_200g, product link, and image_url when available.</w:t>
       </w:r>
     </w:p>
     <w:p>
       <w:pPr>
         <w:pStyle w:val="ListBullet"/>
+        <w:spacing w:after="20"/>
       </w:pPr>
       <w:r>
-        <w:t>If a DOCX routine is edited, render the DOCX and visually inspect the pages before delivery.</w:t>
+        <w:t>The workbook opens successfully and the .xlsx archive has no errors.</w:t>
       </w:r>
     </w:p>
     <w:p>
       <w:pPr>
         <w:pStyle w:val="Heading1"/>
+        <w:spacing w:before="160" w:after="80"/>
       </w:pPr>
       <w:r>
-        <w:t>9. Prompt Pattern for Future Runs</w:t>
-      </w:r>
-    </w:p>
-    <w:p>
-      <w:r>
-        <w:t>Use this mental template when executing the routine:</w:t>
+        <w:t>9. Execution Pattern</w:t>
       </w:r>
     </w:p>
     <w:p>
       <w:pPr>
-        <w:pStyle w:val="ListNumber"/>
+        <w:pStyle w:val="ListBullet"/>
+        <w:spacing w:after="20"/>
       </w:pPr>
       <w:r>
-        <w:t>Read the workbook header and existing table formatting.</w:t>
+        <w:t>Read routine.docx and the workbook header/table structure.</w:t>
       </w:r>
     </w:p>
     <w:p>
       <w:pPr>
-        <w:pStyle w:val="ListNumber"/>
+        <w:pStyle w:val="ListBullet"/>
+        <w:spacing w:after="20"/>
       </w:pPr>
       <w:r>
-        <w:t>Fetch each website collection and identify the best structured product source.</w:t>
+        <w:t>Fetch and cache each source.</w:t>
       </w:r>
     </w:p>
     <w:p>
       <w:pPr>
-        <w:pStyle w:val="ListNumber"/>
+        <w:pStyle w:val="ListBullet"/>
+        <w:spacing w:after="20"/>
       </w:pPr>
       <w:r>
-        <w:t>Extract coffee bean products only.</w:t>
+        <w:t>Extract actual roasted bean listings only.</w:t>
       </w:r>
     </w:p>
     <w:p>
       <w:pPr>
-        <w:pStyle w:val="ListNumber"/>
+        <w:pStyle w:val="ListBullet"/>
+        <w:spacing w:after="20"/>
       </w:pPr>
       <w:r>
-        <w:t>Normalize fields into the master columns.</w:t>
+        <w:t>Normalize fields into the master columns without guessing missing details.</w:t>
       </w:r>
     </w:p>
     <w:p>
       <w:pPr>
-        <w:pStyle w:val="ListNumber"/>
+        <w:pStyle w:val="ListBullet"/>
+        <w:spacing w:after="20"/>
       </w:pPr>
       <w:r>
-        <w:t>Apply fixed validation values exactly.</w:t>
+        <w:t>Normalize price_200g.</w:t>
       </w:r>
     </w:p>
     <w:p>
       <w:pPr>
-        <w:pStyle w:val="ListNumber"/>
+        <w:pStyle w:val="ListBullet"/>
+        <w:spacing w:after="20"/>
       </w:pPr>
       <w:r>
-        <w:t>Normalize prices to 200g.</w:t>
+        <w:t>Write rows according to the requested mode.</w:t>
       </w:r>
     </w:p>
     <w:p>
       <w:pPr>
-        <w:pStyle w:val="ListNumber"/>
+        <w:pStyle w:val="ListBullet"/>
+        <w:spacing w:after="20"/>
       </w:pPr>
       <w:r>
-        <w:t>Write rows into the workbook according to the requested mode.</w:t>
-      </w:r>
-    </w:p>
-    <w:p>
-      <w:pPr>
-        <w:pStyle w:val="ListNumber"/>
-      </w:pPr>
-      <w:r>
-        <w:t>Verify row count, price math, validation values, and workbook integrity.</w:t>
+        <w:t>Run validation, price, row-count, and workbook integrity checks before delivery.</w:t>
       </w:r>
     </w:p>
     <w:sectPr>
       <w:pgSz w:w="12240" w:h="15840"/>
-      <w:pgMar w:top="1440" w:right="1440" w:bottom="1440" w:left="1440" w:header="720" w:footer="720" w:gutter="0"/>
+      <w:pgMar w:top="1080" w:right="1080" w:bottom="1080" w:left="1080" w:header="720" w:footer="720" w:gutter="0"/>
       <w:cols w:space="720"/>
       <w:docGrid w:linePitch="360"/>
     </w:sectPr>
@@ -3354,12 +2305,9 @@
     <w:name w:val="Normal"/>
     <w:qFormat/>
     <w:rsid w:val="00FC693F"/>
-    <w:pPr>
-      <w:spacing w:after="120" w:line="300" w:lineRule="auto"/>
-    </w:pPr>
     <w:rPr>
-      <w:rFonts w:ascii="Calibri" w:hAnsi="Calibri"/>
-      <w:sz w:val="22"/>
+      <w:rFonts w:ascii="Arial" w:hAnsi="Arial"/>
+      <w:sz w:val="20"/>
     </w:rPr>
   </w:style>
   <w:style w:type="paragraph" w:styleId="Header">
@@ -3417,15 +2365,15 @@
     <w:pPr>
       <w:keepNext/>
       <w:keepLines/>
-      <w:spacing w:before="360" w:after="200"/>
+      <w:spacing w:before="480" w:after="0"/>
       <w:outlineLvl w:val="0"/>
     </w:pPr>
     <w:rPr>
-      <w:rFonts w:asciiTheme="majorHAnsi" w:eastAsiaTheme="majorEastAsia" w:hAnsiTheme="majorHAnsi" w:cstheme="majorBidi" w:ascii="Calibri" w:hAnsi="Calibri"/>
+      <w:rFonts w:asciiTheme="majorHAnsi" w:eastAsiaTheme="majorEastAsia" w:hAnsiTheme="majorHAnsi" w:cstheme="majorBidi" w:ascii="Arial" w:hAnsi="Arial"/>
       <w:b/>
       <w:bCs/>
-      <w:color w:val="2E74B5"/>
-      <w:sz w:val="32"/>
+      <w:color w:val="365F91" w:themeColor="accent1" w:themeShade="BF"/>
+      <w:sz w:val="26"/>
       <w:szCs w:val="28"/>
     </w:rPr>
   </w:style>
@@ -3441,15 +2389,15 @@
     <w:pPr>
       <w:keepNext/>
       <w:keepLines/>
-      <w:spacing w:before="280" w:after="140"/>
+      <w:spacing w:before="200" w:after="0"/>
       <w:outlineLvl w:val="1"/>
     </w:pPr>
     <w:rPr>
-      <w:rFonts w:asciiTheme="majorHAnsi" w:eastAsiaTheme="majorEastAsia" w:hAnsiTheme="majorHAnsi" w:cstheme="majorBidi" w:ascii="Calibri" w:hAnsi="Calibri"/>
+      <w:rFonts w:asciiTheme="majorHAnsi" w:eastAsiaTheme="majorEastAsia" w:hAnsiTheme="majorHAnsi" w:cstheme="majorBidi" w:ascii="Arial" w:hAnsi="Arial"/>
       <w:b/>
       <w:bCs/>
-      <w:color w:val="2E74B5"/>
-      <w:sz w:val="26"/>
+      <w:color w:val="4F81BD" w:themeColor="accent1"/>
+      <w:sz w:val="22"/>
       <w:szCs w:val="26"/>
     </w:rPr>
   </w:style>
@@ -3465,15 +2413,14 @@
     <w:pPr>
       <w:keepNext/>
       <w:keepLines/>
-      <w:spacing w:before="200" w:after="100"/>
+      <w:spacing w:before="200" w:after="0"/>
       <w:outlineLvl w:val="2"/>
     </w:pPr>
     <w:rPr>
-      <w:rFonts w:asciiTheme="majorHAnsi" w:eastAsiaTheme="majorEastAsia" w:hAnsiTheme="majorHAnsi" w:cstheme="majorBidi" w:ascii="Calibri" w:hAnsi="Calibri"/>
+      <w:rFonts w:asciiTheme="majorHAnsi" w:eastAsiaTheme="majorEastAsia" w:hAnsiTheme="majorHAnsi" w:cstheme="majorBidi"/>
       <w:b/>
       <w:bCs/>
-      <w:color w:val="1F4D78"/>
-      <w:sz w:val="24"/>
+      <w:color w:val="4F81BD" w:themeColor="accent1"/>
     </w:rPr>
   </w:style>
   <w:style w:type="paragraph" w:styleId="Heading4">
@@ -3711,11 +2658,11 @@
       <w:contextualSpacing/>
     </w:pPr>
     <w:rPr>
-      <w:rFonts w:asciiTheme="majorHAnsi" w:eastAsiaTheme="majorEastAsia" w:hAnsiTheme="majorHAnsi" w:cstheme="majorBidi"/>
+      <w:rFonts w:asciiTheme="majorHAnsi" w:eastAsiaTheme="majorEastAsia" w:hAnsiTheme="majorHAnsi" w:cstheme="majorBidi" w:ascii="Arial" w:hAnsi="Arial"/>
       <w:color w:val="17365D" w:themeColor="text2" w:themeShade="BF"/>
       <w:spacing w:val="5"/>
       <w:kern w:val="28"/>
-      <w:sz w:val="52"/>
+      <w:sz w:val="36"/>
       <w:szCs w:val="52"/>
     </w:rPr>
   </w:style>

</xml_diff>